<commit_message>
Atualiza manual de instalação do fluxo jurídico
</commit_message>
<xml_diff>
--- a/guias/MANUAL-DO-ADVOGADO-FLUXO-JURIDICO-SA-ADVOCACIA.docx
+++ b/guias/MANUAL-DO-ADVOGADO-FLUXO-JURIDICO-SA-ADVOCACIA.docx
@@ -4,6 +4,22 @@
   <w:body>
     <w:p>
       <w:pPr>
+        <w:spacing w:before="0" w:after="920" w:line="276" w:lineRule="auto"/>
+      </w:pPr>
+      <w:r>
+        <w:rPr>
+          <w:rFonts w:ascii="Arial" w:hAnsi="Arial"/>
+          <w:b w:val="0"/>
+          <w:i w:val="0"/>
+          <w:color w:val="FFFFFF"/>
+          <w:sz w:val="2"/>
+        </w:rPr>
+        <w:t xml:space="preserve"> </w:t>
+      </w:r>
+    </w:p>
+    <w:p>
+      <w:pPr>
+        <w:pStyle w:val="Ttulo"/>
         <w:spacing w:before="0" w:after="80" w:line="276" w:lineRule="auto"/>
       </w:pPr>
       <w:r>
@@ -14,7 +30,7 @@
           <w:color w:val="000000"/>
           <w:sz w:val="44"/>
         </w:rPr>
-        <w:t>Manual do Fluxo Jurídico</w:t>
+        <w:t>Manual de instalação do Fluxo Jurídico</w:t>
       </w:r>
     </w:p>
     <w:p>
@@ -29,7 +45,7 @@
           <w:color w:val="595959"/>
           <w:sz w:val="24"/>
         </w:rPr>
-        <w:t>Como organizar um caso e pedir uma peça jurídica com segurança</w:t>
+        <w:t>Como usar no ChatGPT Codex Claude e Claude Code</w:t>
       </w:r>
     </w:p>
     <w:p>
@@ -44,7 +60,7 @@
           <w:color w:val="000000"/>
           <w:sz w:val="22"/>
         </w:rPr>
-        <w:t>Este manual mostra, em linguagem simples, como usar as ferramentas do escritório. Você não precisa entender programação. Basta enviar os documentos, seguir o roteiro e revisar o resultado antes de utilizar a peça.</w:t>
+        <w:t>Este manual ensina como instalar e usar o pacote de trabalho jurídico da Sousa Araújo Advocacia. Você não precisa entender programação. Escolha abaixo a ferramenta que já utiliza e siga somente aquele caminho.</w:t>
       </w:r>
     </w:p>
     <w:p>
@@ -59,97 +75,12 @@
           <w:color w:val="000000"/>
           <w:sz w:val="28"/>
         </w:rPr>
-        <w:t>O que você passa a ter</w:t>
+        <w:t>Link oficial para copiar</w:t>
       </w:r>
     </w:p>
     <w:p>
       <w:pPr>
-        <w:pStyle w:val="Commarcadores"/>
-        <w:spacing w:after="80" w:line="269" w:lineRule="auto"/>
-      </w:pPr>
-      <w:r>
-        <w:rPr>
-          <w:rFonts w:ascii="Arial" w:hAnsi="Arial"/>
-          <w:color w:val="000000"/>
-          <w:sz w:val="22"/>
-        </w:rPr>
-        <w:t>Uma pasta de caso organizada, com os originais preservados.</w:t>
-      </w:r>
-    </w:p>
-    <w:p>
-      <w:pPr>
-        <w:pStyle w:val="Commarcadores"/>
-        <w:spacing w:after="80" w:line="269" w:lineRule="auto"/>
-      </w:pPr>
-      <w:r>
-        <w:rPr>
-          <w:rFonts w:ascii="Arial" w:hAnsi="Arial"/>
-          <w:color w:val="000000"/>
-          <w:sz w:val="22"/>
-        </w:rPr>
-        <w:t>Provas numeradas de forma permanente, como PROVA-0001 e PROVA-0002.</w:t>
-      </w:r>
-    </w:p>
-    <w:p>
-      <w:pPr>
-        <w:pStyle w:val="Commarcadores"/>
-        <w:spacing w:after="80" w:line="269" w:lineRule="auto"/>
-      </w:pPr>
-      <w:r>
-        <w:rPr>
-          <w:rFonts w:ascii="Arial" w:hAnsi="Arial"/>
-          <w:color w:val="000000"/>
-          <w:sz w:val="22"/>
-        </w:rPr>
-        <w:t>Processos, conversas, áudios e vídeos organizados para consulta posterior.</w:t>
-      </w:r>
-    </w:p>
-    <w:p>
-      <w:pPr>
-        <w:pStyle w:val="Commarcadores"/>
-        <w:spacing w:after="80" w:line="269" w:lineRule="auto"/>
-      </w:pPr>
-      <w:r>
-        <w:rPr>
-          <w:rFonts w:ascii="Arial" w:hAnsi="Arial"/>
-          <w:color w:val="000000"/>
-          <w:sz w:val="22"/>
-        </w:rPr>
-        <w:t>Resumo do caso, linha do tempo, índice de provas e lista de pendências.</w:t>
-      </w:r>
-    </w:p>
-    <w:p>
-      <w:pPr>
-        <w:pStyle w:val="Commarcadores"/>
-        <w:spacing w:after="80" w:line="269" w:lineRule="auto"/>
-      </w:pPr>
-      <w:r>
-        <w:rPr>
-          <w:rFonts w:ascii="Arial" w:hAnsi="Arial"/>
-          <w:color w:val="000000"/>
-          <w:sz w:val="22"/>
-        </w:rPr>
-        <w:t>Peças jurídicas em Word, seguindo o padrão do escritório e o papel timbrado oficial.</w:t>
-      </w:r>
-    </w:p>
-    <w:p>
-      <w:pPr>
-        <w:keepNext/>
-        <w:spacing w:before="280" w:after="120"/>
-      </w:pPr>
-      <w:r>
-        <w:rPr>
-          <w:rFonts w:ascii="Arial" w:hAnsi="Arial"/>
-          <w:b/>
-          <w:color w:val="000000"/>
-          <w:sz w:val="28"/>
-        </w:rPr>
-        <w:t>Antes de começar</w:t>
-      </w:r>
-    </w:p>
-    <w:p>
-      <w:pPr>
-        <w:spacing w:before="0" w:after="140" w:line="276" w:lineRule="auto"/>
+        <w:spacing w:before="0" w:after="40" w:line="276" w:lineRule="auto"/>
       </w:pPr>
       <w:r>
         <w:rPr>
@@ -159,12 +90,296 @@
           <w:color w:val="000000"/>
           <w:sz w:val="22"/>
         </w:rPr>
-        <w:t>Você precisa de uma pasta no computador para cada caso e acesso ao ChatGPT ou ao Claude configurado pelo escritório. Nunca envie documentos de clientes para o GitHub.</w:t>
+        <w:t>Copie o endereço abaixo exatamente como está.</w:t>
       </w:r>
     </w:p>
     <w:p>
       <w:pPr>
-        <w:spacing w:before="0" w:after="200" w:line="276" w:lineRule="auto"/>
+        <w:keepNext/>
+        <w:spacing w:before="60" w:after="200"/>
+      </w:pPr>
+      <w:hyperlink r:id="rId11">
+        <w:r>
+          <w:rPr>
+            <w:color w:val="0563C1"/>
+            <w:u w:val="single"/>
+          </w:rPr>
+          <w:t>https://github.com/mix7producao/fluxo-juridico</w:t>
+        </w:r>
+      </w:hyperlink>
+    </w:p>
+    <w:p>
+      <w:pPr>
+        <w:keepNext/>
+        <w:spacing w:before="280" w:after="120"/>
+      </w:pPr>
+      <w:r>
+        <w:rPr>
+          <w:rFonts w:ascii="Arial" w:hAnsi="Arial"/>
+          <w:b/>
+          <w:color w:val="000000"/>
+          <w:sz w:val="28"/>
+        </w:rPr>
+        <w:t>O que o pacote faz</w:t>
+      </w:r>
+    </w:p>
+    <w:p>
+      <w:pPr>
+        <w:spacing w:after="80" w:line="269" w:lineRule="auto"/>
+        <w:ind w:left="369" w:hanging="198"/>
+      </w:pPr>
+      <w:r>
+        <w:rPr>
+          <w:rFonts w:ascii="Arial" w:hAnsi="Arial"/>
+          <w:color w:val="000000"/>
+          <w:sz w:val="22"/>
+        </w:rPr>
+        <w:t xml:space="preserve">• </w:t>
+      </w:r>
+      <w:r>
+        <w:rPr>
+          <w:rFonts w:ascii="Arial" w:hAnsi="Arial"/>
+          <w:color w:val="000000"/>
+          <w:sz w:val="22"/>
+        </w:rPr>
+        <w:t>Organiza processos, documentos, conversas, áudios, vídeos e demais provas sem alterar os originais.</w:t>
+      </w:r>
+    </w:p>
+    <w:p>
+      <w:pPr>
+        <w:spacing w:after="80" w:line="269" w:lineRule="auto"/>
+        <w:ind w:left="369" w:hanging="198"/>
+      </w:pPr>
+      <w:r>
+        <w:rPr>
+          <w:rFonts w:ascii="Arial" w:hAnsi="Arial"/>
+          <w:color w:val="000000"/>
+          <w:sz w:val="22"/>
+        </w:rPr>
+        <w:t xml:space="preserve">• </w:t>
+      </w:r>
+      <w:r>
+        <w:rPr>
+          <w:rFonts w:ascii="Arial" w:hAnsi="Arial"/>
+          <w:color w:val="000000"/>
+          <w:sz w:val="22"/>
+        </w:rPr>
+        <w:t>Cria índice, linha do tempo, resumo, perguntas pendentes e identificação permanente das provas, como PROVA-0001.</w:t>
+      </w:r>
+    </w:p>
+    <w:p>
+      <w:pPr>
+        <w:spacing w:after="80" w:line="269" w:lineRule="auto"/>
+        <w:ind w:left="369" w:hanging="198"/>
+      </w:pPr>
+      <w:r>
+        <w:rPr>
+          <w:rFonts w:ascii="Arial" w:hAnsi="Arial"/>
+          <w:color w:val="000000"/>
+          <w:sz w:val="22"/>
+        </w:rPr>
+        <w:t xml:space="preserve">• </w:t>
+      </w:r>
+      <w:r>
+        <w:rPr>
+          <w:rFonts w:ascii="Arial" w:hAnsi="Arial"/>
+          <w:color w:val="000000"/>
+          <w:sz w:val="22"/>
+        </w:rPr>
+        <w:t>Produz e revisa peças jurídicas em Word, depois que o caso estiver organizado.</w:t>
+      </w:r>
+    </w:p>
+    <w:p>
+      <w:pPr>
+        <w:spacing w:after="80" w:line="269" w:lineRule="auto"/>
+        <w:ind w:left="369" w:hanging="198"/>
+      </w:pPr>
+      <w:r>
+        <w:rPr>
+          <w:rFonts w:ascii="Arial" w:hAnsi="Arial"/>
+          <w:color w:val="000000"/>
+          <w:sz w:val="22"/>
+        </w:rPr>
+        <w:t xml:space="preserve">• </w:t>
+      </w:r>
+      <w:r>
+        <w:rPr>
+          <w:rFonts w:ascii="Arial" w:hAnsi="Arial"/>
+          <w:color w:val="000000"/>
+          <w:sz w:val="22"/>
+        </w:rPr>
+        <w:t>Aplica o papel timbrado oficial, a formatação e as cores definidas pelo escritório.</w:t>
+      </w:r>
+    </w:p>
+    <w:p>
+      <w:pPr>
+        <w:spacing w:after="80" w:line="269" w:lineRule="auto"/>
+        <w:ind w:left="369" w:hanging="198"/>
+      </w:pPr>
+      <w:r>
+        <w:rPr>
+          <w:rFonts w:ascii="Arial" w:hAnsi="Arial"/>
+          <w:color w:val="000000"/>
+          <w:sz w:val="22"/>
+        </w:rPr>
+        <w:t xml:space="preserve">• </w:t>
+      </w:r>
+      <w:r>
+        <w:rPr>
+          <w:rFonts w:ascii="Arial" w:hAnsi="Arial"/>
+          <w:color w:val="000000"/>
+          <w:sz w:val="22"/>
+        </w:rPr>
+        <w:t>Ajuda a criar conteúdo jurídico institucional e educativo dentro das regras do escritório.</w:t>
+      </w:r>
+    </w:p>
+    <w:p>
+      <w:pPr>
+        <w:keepNext/>
+        <w:spacing w:before="280" w:after="120"/>
+      </w:pPr>
+      <w:r>
+        <w:rPr>
+          <w:rFonts w:ascii="Arial" w:hAnsi="Arial"/>
+          <w:b/>
+          <w:color w:val="000000"/>
+          <w:sz w:val="28"/>
+        </w:rPr>
+        <w:t>Qual opção escolher</w:t>
+      </w:r>
+    </w:p>
+    <w:p>
+      <w:pPr>
+        <w:spacing w:after="80" w:line="269" w:lineRule="auto"/>
+        <w:ind w:left="369" w:hanging="198"/>
+      </w:pPr>
+      <w:r>
+        <w:rPr>
+          <w:rFonts w:ascii="Arial" w:hAnsi="Arial"/>
+          <w:color w:val="000000"/>
+          <w:sz w:val="22"/>
+        </w:rPr>
+        <w:t xml:space="preserve">• </w:t>
+      </w:r>
+      <w:r>
+        <w:rPr>
+          <w:rFonts w:ascii="Arial" w:hAnsi="Arial"/>
+          <w:color w:val="000000"/>
+          <w:sz w:val="22"/>
+        </w:rPr>
+        <w:t>ChatGPT: recomendado para a equipe. O administrador importa uma vez.</w:t>
+      </w:r>
+    </w:p>
+    <w:p>
+      <w:pPr>
+        <w:spacing w:after="80" w:line="269" w:lineRule="auto"/>
+        <w:ind w:left="369" w:hanging="198"/>
+      </w:pPr>
+      <w:r>
+        <w:rPr>
+          <w:rFonts w:ascii="Arial" w:hAnsi="Arial"/>
+          <w:color w:val="000000"/>
+          <w:sz w:val="22"/>
+        </w:rPr>
+        <w:t xml:space="preserve">• </w:t>
+      </w:r>
+      <w:r>
+        <w:rPr>
+          <w:rFonts w:ascii="Arial" w:hAnsi="Arial"/>
+          <w:color w:val="000000"/>
+          <w:sz w:val="22"/>
+        </w:rPr>
+        <w:t>Codex: recomendado para organizar pastas, arquivos e peças em Word.</w:t>
+      </w:r>
+    </w:p>
+    <w:p>
+      <w:pPr>
+        <w:spacing w:after="80" w:line="269" w:lineRule="auto"/>
+        <w:ind w:left="369" w:hanging="198"/>
+      </w:pPr>
+      <w:r>
+        <w:rPr>
+          <w:rFonts w:ascii="Arial" w:hAnsi="Arial"/>
+          <w:color w:val="000000"/>
+          <w:sz w:val="22"/>
+        </w:rPr>
+        <w:t xml:space="preserve">• </w:t>
+      </w:r>
+      <w:r>
+        <w:rPr>
+          <w:rFonts w:ascii="Arial" w:hAnsi="Arial"/>
+          <w:color w:val="000000"/>
+          <w:sz w:val="22"/>
+        </w:rPr>
+        <w:t>Claude: uso simples no navegador por meio de um Projeto conectado ao GitHub.</w:t>
+      </w:r>
+    </w:p>
+    <w:p>
+      <w:pPr>
+        <w:spacing w:after="80" w:line="269" w:lineRule="auto"/>
+        <w:ind w:left="369" w:hanging="198"/>
+      </w:pPr>
+      <w:r>
+        <w:rPr>
+          <w:rFonts w:ascii="Arial" w:hAnsi="Arial"/>
+          <w:color w:val="000000"/>
+          <w:sz w:val="22"/>
+        </w:rPr>
+        <w:t xml:space="preserve">• </w:t>
+      </w:r>
+      <w:r>
+        <w:rPr>
+          <w:rFonts w:ascii="Arial" w:hAnsi="Arial"/>
+          <w:color w:val="000000"/>
+          <w:sz w:val="22"/>
+        </w:rPr>
+        <w:t>Claude Code: trabalho completo com pastas e arquivos, instalado com dois comandos.</w:t>
+      </w:r>
+    </w:p>
+    <w:p>
+      <w:pPr>
+        <w:sectPr>
+          <w:headerReference w:type="default" r:id="rId8"/>
+          <w:pgSz w:w="11906" w:h="16838"/>
+          <w:pgMar w:top="2268" w:right="1134" w:bottom="1701" w:left="1701" w:header="0" w:footer="0" w:gutter="0"/>
+          <w:cols w:space="720"/>
+          <w:docGrid w:linePitch="360"/>
+        </w:sectPr>
+      </w:pPr>
+    </w:p>
+    <w:p>
+      <w:pPr>
+        <w:spacing w:before="0" w:after="920" w:line="276" w:lineRule="auto"/>
+      </w:pPr>
+      <w:r>
+        <w:rPr>
+          <w:rFonts w:ascii="Arial" w:hAnsi="Arial"/>
+          <w:b w:val="0"/>
+          <w:i w:val="0"/>
+          <w:color w:val="FFFFFF"/>
+          <w:sz w:val="2"/>
+        </w:rPr>
+        <w:t xml:space="preserve"> </w:t>
+      </w:r>
+    </w:p>
+    <w:p>
+      <w:pPr>
+        <w:keepNext/>
+        <w:spacing w:before="280" w:after="120"/>
+      </w:pPr>
+      <w:r>
+        <w:rPr>
+          <w:rFonts w:ascii="Arial" w:hAnsi="Arial"/>
+          <w:b/>
+          <w:color w:val="000000"/>
+          <w:sz w:val="28"/>
+        </w:rPr>
+        <w:t>ChatGPT para a equipe</w:t>
+      </w:r>
+    </w:p>
+    <w:p>
+      <w:pPr>
+        <w:spacing w:before="0" w:after="160" w:line="276" w:lineRule="auto"/>
       </w:pPr>
       <w:r>
         <w:rPr>
@@ -174,785 +389,7 @@
           <w:color w:val="000000"/>
           <w:sz w:val="22"/>
         </w:rPr>
-        <w:t>Ao receber documentos, coloque tudo na pasta do caso: processo completo, conversas, áudios, vídeos, fotos, contratos, comprovantes, decisões e intimações.</w:t>
-      </w:r>
-    </w:p>
-    <w:p>
-      <w:pPr>
-        <w:keepNext/>
-        <w:spacing w:before="280" w:after="120"/>
-      </w:pPr>
-      <w:r>
-        <w:rPr>
-          <w:rFonts w:ascii="Arial" w:hAnsi="Arial"/>
-          <w:b/>
-          <w:color w:val="000000"/>
-          <w:sz w:val="28"/>
-        </w:rPr>
-        <w:t>Passo a passo para organizar um caso</w:t>
-      </w:r>
-    </w:p>
-    <w:tbl>
-      <w:tblPr>
-        <w:tblW w:type="auto" w:w="0"/>
-        <w:tblLayout w:type="fixed"/>
-        <w:tblLook w:firstColumn="1" w:firstRow="1" w:lastColumn="0" w:lastRow="0" w:noHBand="0" w:noVBand="1" w:val="04A0"/>
-      </w:tblPr>
-      <w:tblGrid>
-        <w:gridCol w:w="3024"/>
-        <w:gridCol w:w="3024"/>
-        <w:gridCol w:w="3024"/>
-      </w:tblGrid>
-      <w:tr>
-        <w:trPr>
-          <w:tblHeader w:val="true"/>
-        </w:trPr>
-        <w:tc>
-          <w:tcPr>
-            <w:tcW w:type="dxa" w:w="737"/>
-            <w:vAlign w:val="center"/>
-            <w:tcMar>
-              <w:top w:w="120" w:type="dxa"/>
-              <w:start w:w="140" w:type="dxa"/>
-              <w:bottom w:w="120" w:type="dxa"/>
-              <w:end w:w="140" w:type="dxa"/>
-            </w:tcMar>
-            <w:tcBorders>
-              <w:top w:val="single" w:sz="6" w:color="D9D9D9"/>
-              <w:left w:val="single" w:sz="6" w:color="D9D9D9"/>
-              <w:bottom w:val="single" w:sz="6" w:color="D9D9D9"/>
-              <w:right w:val="single" w:sz="6" w:color="D9D9D9"/>
-            </w:tcBorders>
-            <w:shd w:fill="D9C9BA"/>
-          </w:tcPr>
-          <w:p>
-            <w:pPr>
-              <w:spacing w:after="0" w:before="0"/>
-            </w:pPr>
-            <w:r>
-              <w:rPr>
-                <w:rFonts w:ascii="Arial" w:hAnsi="Arial"/>
-                <w:b/>
-                <w:color w:val="000000"/>
-                <w:sz w:val="21"/>
-              </w:rPr>
-              <w:t>Nº</w:t>
-            </w:r>
-          </w:p>
-        </w:tc>
-        <w:tc>
-          <w:tcPr>
-            <w:tcW w:type="dxa" w:w="3969"/>
-            <w:vAlign w:val="center"/>
-            <w:tcMar>
-              <w:top w:w="120" w:type="dxa"/>
-              <w:start w:w="140" w:type="dxa"/>
-              <w:bottom w:w="120" w:type="dxa"/>
-              <w:end w:w="140" w:type="dxa"/>
-            </w:tcMar>
-            <w:tcBorders>
-              <w:top w:val="single" w:sz="6" w:color="D9D9D9"/>
-              <w:left w:val="single" w:sz="6" w:color="D9D9D9"/>
-              <w:bottom w:val="single" w:sz="6" w:color="D9D9D9"/>
-              <w:right w:val="single" w:sz="6" w:color="D9D9D9"/>
-            </w:tcBorders>
-            <w:shd w:fill="D9C9BA"/>
-          </w:tcPr>
-          <w:p>
-            <w:pPr>
-              <w:spacing w:after="0" w:before="0"/>
-            </w:pPr>
-            <w:r>
-              <w:rPr>
-                <w:rFonts w:ascii="Arial" w:hAnsi="Arial"/>
-                <w:b/>
-                <w:color w:val="000000"/>
-                <w:sz w:val="21"/>
-              </w:rPr>
-              <w:t>O que você faz</w:t>
-            </w:r>
-          </w:p>
-        </w:tc>
-        <w:tc>
-          <w:tcPr>
-            <w:tcW w:type="dxa" w:w="3969"/>
-            <w:vAlign w:val="center"/>
-            <w:tcMar>
-              <w:top w:w="120" w:type="dxa"/>
-              <w:start w:w="140" w:type="dxa"/>
-              <w:bottom w:w="120" w:type="dxa"/>
-              <w:end w:w="140" w:type="dxa"/>
-            </w:tcMar>
-            <w:tcBorders>
-              <w:top w:val="single" w:sz="6" w:color="D9D9D9"/>
-              <w:left w:val="single" w:sz="6" w:color="D9D9D9"/>
-              <w:bottom w:val="single" w:sz="6" w:color="D9D9D9"/>
-              <w:right w:val="single" w:sz="6" w:color="D9D9D9"/>
-            </w:tcBorders>
-            <w:shd w:fill="D9C9BA"/>
-          </w:tcPr>
-          <w:p>
-            <w:pPr>
-              <w:spacing w:after="0" w:before="0"/>
-            </w:pPr>
-            <w:r>
-              <w:rPr>
-                <w:rFonts w:ascii="Arial" w:hAnsi="Arial"/>
-                <w:b/>
-                <w:color w:val="000000"/>
-                <w:sz w:val="21"/>
-              </w:rPr>
-              <w:t>O que a ferramenta entrega</w:t>
-            </w:r>
-          </w:p>
-        </w:tc>
-      </w:tr>
-      <w:tr>
-        <w:tc>
-          <w:tcPr>
-            <w:tcW w:type="dxa" w:w="737"/>
-            <w:vAlign w:val="center"/>
-            <w:tcMar>
-              <w:top w:w="120" w:type="dxa"/>
-              <w:start w:w="140" w:type="dxa"/>
-              <w:bottom w:w="120" w:type="dxa"/>
-              <w:end w:w="140" w:type="dxa"/>
-            </w:tcMar>
-            <w:tcBorders>
-              <w:top w:val="single" w:sz="6" w:color="D9D9D9"/>
-              <w:left w:val="single" w:sz="6" w:color="D9D9D9"/>
-              <w:bottom w:val="single" w:sz="6" w:color="D9D9D9"/>
-              <w:right w:val="single" w:sz="6" w:color="D9D9D9"/>
-            </w:tcBorders>
-          </w:tcPr>
-          <w:p>
-            <w:pPr>
-              <w:spacing w:after="0" w:before="0"/>
-              <w:jc w:val="center"/>
-            </w:pPr>
-            <w:r>
-              <w:rPr>
-                <w:rFonts w:ascii="Arial" w:hAnsi="Arial"/>
-                <w:b w:val="0"/>
-                <w:color w:val="000000"/>
-                <w:sz w:val="21"/>
-              </w:rPr>
-              <w:t>1</w:t>
-            </w:r>
-          </w:p>
-        </w:tc>
-        <w:tc>
-          <w:tcPr>
-            <w:tcW w:type="dxa" w:w="3969"/>
-            <w:vAlign w:val="center"/>
-            <w:tcMar>
-              <w:top w:w="120" w:type="dxa"/>
-              <w:start w:w="140" w:type="dxa"/>
-              <w:bottom w:w="120" w:type="dxa"/>
-              <w:end w:w="140" w:type="dxa"/>
-            </w:tcMar>
-            <w:tcBorders>
-              <w:top w:val="single" w:sz="6" w:color="D9D9D9"/>
-              <w:left w:val="single" w:sz="6" w:color="D9D9D9"/>
-              <w:bottom w:val="single" w:sz="6" w:color="D9D9D9"/>
-              <w:right w:val="single" w:sz="6" w:color="D9D9D9"/>
-            </w:tcBorders>
-          </w:tcPr>
-          <w:p>
-            <w:pPr>
-              <w:spacing w:after="0" w:before="0"/>
-            </w:pPr>
-            <w:r>
-              <w:rPr>
-                <w:rFonts w:ascii="Arial" w:hAnsi="Arial"/>
-                <w:b w:val="0"/>
-                <w:color w:val="000000"/>
-                <w:sz w:val="21"/>
-              </w:rPr>
-              <w:t>Crie uma pasta com o nome interno do caso.</w:t>
-            </w:r>
-          </w:p>
-        </w:tc>
-        <w:tc>
-          <w:tcPr>
-            <w:tcW w:type="dxa" w:w="3969"/>
-            <w:vAlign w:val="center"/>
-            <w:tcMar>
-              <w:top w:w="120" w:type="dxa"/>
-              <w:start w:w="140" w:type="dxa"/>
-              <w:bottom w:w="120" w:type="dxa"/>
-              <w:end w:w="140" w:type="dxa"/>
-            </w:tcMar>
-            <w:tcBorders>
-              <w:top w:val="single" w:sz="6" w:color="D9D9D9"/>
-              <w:left w:val="single" w:sz="6" w:color="D9D9D9"/>
-              <w:bottom w:val="single" w:sz="6" w:color="D9D9D9"/>
-              <w:right w:val="single" w:sz="6" w:color="D9D9D9"/>
-            </w:tcBorders>
-          </w:tcPr>
-          <w:p>
-            <w:pPr>
-              <w:spacing w:after="0" w:before="0"/>
-            </w:pPr>
-            <w:r>
-              <w:rPr>
-                <w:rFonts w:ascii="Arial" w:hAnsi="Arial"/>
-                <w:b w:val="0"/>
-                <w:color w:val="000000"/>
-                <w:sz w:val="21"/>
-              </w:rPr>
-              <w:t>Uma estrutura segura para receber tudo.</w:t>
-            </w:r>
-          </w:p>
-        </w:tc>
-      </w:tr>
-      <w:tr>
-        <w:tc>
-          <w:tcPr>
-            <w:tcW w:type="dxa" w:w="737"/>
-            <w:vAlign w:val="center"/>
-            <w:tcMar>
-              <w:top w:w="120" w:type="dxa"/>
-              <w:start w:w="140" w:type="dxa"/>
-              <w:bottom w:w="120" w:type="dxa"/>
-              <w:end w:w="140" w:type="dxa"/>
-            </w:tcMar>
-            <w:tcBorders>
-              <w:top w:val="single" w:sz="6" w:color="D9D9D9"/>
-              <w:left w:val="single" w:sz="6" w:color="D9D9D9"/>
-              <w:bottom w:val="single" w:sz="6" w:color="D9D9D9"/>
-              <w:right w:val="single" w:sz="6" w:color="D9D9D9"/>
-            </w:tcBorders>
-            <w:shd w:fill="F7F3F0"/>
-          </w:tcPr>
-          <w:p>
-            <w:pPr>
-              <w:spacing w:after="0" w:before="0"/>
-              <w:jc w:val="center"/>
-            </w:pPr>
-            <w:r>
-              <w:rPr>
-                <w:rFonts w:ascii="Arial" w:hAnsi="Arial"/>
-                <w:b w:val="0"/>
-                <w:color w:val="000000"/>
-                <w:sz w:val="21"/>
-              </w:rPr>
-              <w:t>2</w:t>
-            </w:r>
-          </w:p>
-        </w:tc>
-        <w:tc>
-          <w:tcPr>
-            <w:tcW w:type="dxa" w:w="3969"/>
-            <w:vAlign w:val="center"/>
-            <w:tcMar>
-              <w:top w:w="120" w:type="dxa"/>
-              <w:start w:w="140" w:type="dxa"/>
-              <w:bottom w:w="120" w:type="dxa"/>
-              <w:end w:w="140" w:type="dxa"/>
-            </w:tcMar>
-            <w:tcBorders>
-              <w:top w:val="single" w:sz="6" w:color="D9D9D9"/>
-              <w:left w:val="single" w:sz="6" w:color="D9D9D9"/>
-              <w:bottom w:val="single" w:sz="6" w:color="D9D9D9"/>
-              <w:right w:val="single" w:sz="6" w:color="D9D9D9"/>
-            </w:tcBorders>
-            <w:shd w:fill="F7F3F0"/>
-          </w:tcPr>
-          <w:p>
-            <w:pPr>
-              <w:spacing w:after="0" w:before="0"/>
-            </w:pPr>
-            <w:r>
-              <w:rPr>
-                <w:rFonts w:ascii="Arial" w:hAnsi="Arial"/>
-                <w:b w:val="0"/>
-                <w:color w:val="000000"/>
-                <w:sz w:val="21"/>
-              </w:rPr>
-              <w:t>Coloque todos os arquivos recebidos nessa pasta.</w:t>
-            </w:r>
-          </w:p>
-        </w:tc>
-        <w:tc>
-          <w:tcPr>
-            <w:tcW w:type="dxa" w:w="3969"/>
-            <w:vAlign w:val="center"/>
-            <w:tcMar>
-              <w:top w:w="120" w:type="dxa"/>
-              <w:start w:w="140" w:type="dxa"/>
-              <w:bottom w:w="120" w:type="dxa"/>
-              <w:end w:w="140" w:type="dxa"/>
-            </w:tcMar>
-            <w:tcBorders>
-              <w:top w:val="single" w:sz="6" w:color="D9D9D9"/>
-              <w:left w:val="single" w:sz="6" w:color="D9D9D9"/>
-              <w:bottom w:val="single" w:sz="6" w:color="D9D9D9"/>
-              <w:right w:val="single" w:sz="6" w:color="D9D9D9"/>
-            </w:tcBorders>
-            <w:shd w:fill="F7F3F0"/>
-          </w:tcPr>
-          <w:p>
-            <w:pPr>
-              <w:spacing w:after="0" w:before="0"/>
-            </w:pPr>
-            <w:r>
-              <w:rPr>
-                <w:rFonts w:ascii="Arial" w:hAnsi="Arial"/>
-                <w:b w:val="0"/>
-                <w:color w:val="000000"/>
-                <w:sz w:val="21"/>
-              </w:rPr>
-              <w:t>Nada é descartado ou alterado nos originais.</w:t>
-            </w:r>
-          </w:p>
-        </w:tc>
-      </w:tr>
-      <w:tr>
-        <w:tc>
-          <w:tcPr>
-            <w:tcW w:type="dxa" w:w="737"/>
-            <w:vAlign w:val="center"/>
-            <w:tcMar>
-              <w:top w:w="120" w:type="dxa"/>
-              <w:start w:w="140" w:type="dxa"/>
-              <w:bottom w:w="120" w:type="dxa"/>
-              <w:end w:w="140" w:type="dxa"/>
-            </w:tcMar>
-            <w:tcBorders>
-              <w:top w:val="single" w:sz="6" w:color="D9D9D9"/>
-              <w:left w:val="single" w:sz="6" w:color="D9D9D9"/>
-              <w:bottom w:val="single" w:sz="6" w:color="D9D9D9"/>
-              <w:right w:val="single" w:sz="6" w:color="D9D9D9"/>
-            </w:tcBorders>
-          </w:tcPr>
-          <w:p>
-            <w:pPr>
-              <w:spacing w:after="0" w:before="0"/>
-              <w:jc w:val="center"/>
-            </w:pPr>
-            <w:r>
-              <w:rPr>
-                <w:rFonts w:ascii="Arial" w:hAnsi="Arial"/>
-                <w:b w:val="0"/>
-                <w:color w:val="000000"/>
-                <w:sz w:val="21"/>
-              </w:rPr>
-              <w:t>3</w:t>
-            </w:r>
-          </w:p>
-        </w:tc>
-        <w:tc>
-          <w:tcPr>
-            <w:tcW w:type="dxa" w:w="3969"/>
-            <w:vAlign w:val="center"/>
-            <w:tcMar>
-              <w:top w:w="120" w:type="dxa"/>
-              <w:start w:w="140" w:type="dxa"/>
-              <w:bottom w:w="120" w:type="dxa"/>
-              <w:end w:w="140" w:type="dxa"/>
-            </w:tcMar>
-            <w:tcBorders>
-              <w:top w:val="single" w:sz="6" w:color="D9D9D9"/>
-              <w:left w:val="single" w:sz="6" w:color="D9D9D9"/>
-              <w:bottom w:val="single" w:sz="6" w:color="D9D9D9"/>
-              <w:right w:val="single" w:sz="6" w:color="D9D9D9"/>
-            </w:tcBorders>
-          </w:tcPr>
-          <w:p>
-            <w:pPr>
-              <w:spacing w:after="0" w:before="0"/>
-            </w:pPr>
-            <w:r>
-              <w:rPr>
-                <w:rFonts w:ascii="Arial" w:hAnsi="Arial"/>
-                <w:b w:val="0"/>
-                <w:color w:val="000000"/>
-                <w:sz w:val="21"/>
-              </w:rPr>
-              <w:t>No WhatsApp, exporte a conversa com mídias e guarde o arquivo ZIP intacto.</w:t>
-            </w:r>
-          </w:p>
-        </w:tc>
-        <w:tc>
-          <w:tcPr>
-            <w:tcW w:type="dxa" w:w="3969"/>
-            <w:vAlign w:val="center"/>
-            <w:tcMar>
-              <w:top w:w="120" w:type="dxa"/>
-              <w:start w:w="140" w:type="dxa"/>
-              <w:bottom w:w="120" w:type="dxa"/>
-              <w:end w:w="140" w:type="dxa"/>
-            </w:tcMar>
-            <w:tcBorders>
-              <w:top w:val="single" w:sz="6" w:color="D9D9D9"/>
-              <w:left w:val="single" w:sz="6" w:color="D9D9D9"/>
-              <w:bottom w:val="single" w:sz="6" w:color="D9D9D9"/>
-              <w:right w:val="single" w:sz="6" w:color="D9D9D9"/>
-            </w:tcBorders>
-          </w:tcPr>
-          <w:p>
-            <w:pPr>
-              <w:spacing w:after="0" w:before="0"/>
-            </w:pPr>
-            <w:r>
-              <w:rPr>
-                <w:rFonts w:ascii="Arial" w:hAnsi="Arial"/>
-                <w:b w:val="0"/>
-                <w:color w:val="000000"/>
-                <w:sz w:val="21"/>
-              </w:rPr>
-              <w:t>A conversa pode ser organizada e transcrita sem perder o arquivo original.</w:t>
-            </w:r>
-          </w:p>
-        </w:tc>
-      </w:tr>
-      <w:tr>
-        <w:tc>
-          <w:tcPr>
-            <w:tcW w:type="dxa" w:w="737"/>
-            <w:vAlign w:val="center"/>
-            <w:tcMar>
-              <w:top w:w="120" w:type="dxa"/>
-              <w:start w:w="140" w:type="dxa"/>
-              <w:bottom w:w="120" w:type="dxa"/>
-              <w:end w:w="140" w:type="dxa"/>
-            </w:tcMar>
-            <w:tcBorders>
-              <w:top w:val="single" w:sz="6" w:color="D9D9D9"/>
-              <w:left w:val="single" w:sz="6" w:color="D9D9D9"/>
-              <w:bottom w:val="single" w:sz="6" w:color="D9D9D9"/>
-              <w:right w:val="single" w:sz="6" w:color="D9D9D9"/>
-            </w:tcBorders>
-            <w:shd w:fill="F7F3F0"/>
-          </w:tcPr>
-          <w:p>
-            <w:pPr>
-              <w:spacing w:after="0" w:before="0"/>
-              <w:jc w:val="center"/>
-            </w:pPr>
-            <w:r>
-              <w:rPr>
-                <w:rFonts w:ascii="Arial" w:hAnsi="Arial"/>
-                <w:b w:val="0"/>
-                <w:color w:val="000000"/>
-                <w:sz w:val="21"/>
-              </w:rPr>
-              <w:t>4</w:t>
-            </w:r>
-          </w:p>
-        </w:tc>
-        <w:tc>
-          <w:tcPr>
-            <w:tcW w:type="dxa" w:w="3969"/>
-            <w:vAlign w:val="center"/>
-            <w:tcMar>
-              <w:top w:w="120" w:type="dxa"/>
-              <w:start w:w="140" w:type="dxa"/>
-              <w:bottom w:w="120" w:type="dxa"/>
-              <w:end w:w="140" w:type="dxa"/>
-            </w:tcMar>
-            <w:tcBorders>
-              <w:top w:val="single" w:sz="6" w:color="D9D9D9"/>
-              <w:left w:val="single" w:sz="6" w:color="D9D9D9"/>
-              <w:bottom w:val="single" w:sz="6" w:color="D9D9D9"/>
-              <w:right w:val="single" w:sz="6" w:color="D9D9D9"/>
-            </w:tcBorders>
-            <w:shd w:fill="F7F3F0"/>
-          </w:tcPr>
-          <w:p>
-            <w:pPr>
-              <w:spacing w:after="0" w:before="0"/>
-            </w:pPr>
-            <w:r>
-              <w:rPr>
-                <w:rFonts w:ascii="Arial" w:hAnsi="Arial"/>
-                <w:b w:val="0"/>
-                <w:color w:val="000000"/>
-                <w:sz w:val="21"/>
-              </w:rPr>
-              <w:t>Abra uma conversa nova e peça a abertura do caso.</w:t>
-            </w:r>
-          </w:p>
-        </w:tc>
-        <w:tc>
-          <w:tcPr>
-            <w:tcW w:type="dxa" w:w="3969"/>
-            <w:vAlign w:val="center"/>
-            <w:tcMar>
-              <w:top w:w="120" w:type="dxa"/>
-              <w:start w:w="140" w:type="dxa"/>
-              <w:bottom w:w="120" w:type="dxa"/>
-              <w:end w:w="140" w:type="dxa"/>
-            </w:tcMar>
-            <w:tcBorders>
-              <w:top w:val="single" w:sz="6" w:color="D9D9D9"/>
-              <w:left w:val="single" w:sz="6" w:color="D9D9D9"/>
-              <w:bottom w:val="single" w:sz="6" w:color="D9D9D9"/>
-              <w:right w:val="single" w:sz="6" w:color="D9D9D9"/>
-            </w:tcBorders>
-            <w:shd w:fill="F7F3F0"/>
-          </w:tcPr>
-          <w:p>
-            <w:pPr>
-              <w:spacing w:after="0" w:before="0"/>
-            </w:pPr>
-            <w:r>
-              <w:rPr>
-                <w:rFonts w:ascii="Arial" w:hAnsi="Arial"/>
-                <w:b w:val="0"/>
-                <w:color w:val="000000"/>
-                <w:sz w:val="21"/>
-              </w:rPr>
-              <w:t>A ferramenta mostra um lembrete do que conferir antes de organizar.</w:t>
-            </w:r>
-          </w:p>
-        </w:tc>
-      </w:tr>
-      <w:tr>
-        <w:tc>
-          <w:tcPr>
-            <w:tcW w:type="dxa" w:w="737"/>
-            <w:vAlign w:val="center"/>
-            <w:tcMar>
-              <w:top w:w="120" w:type="dxa"/>
-              <w:start w:w="140" w:type="dxa"/>
-              <w:bottom w:w="120" w:type="dxa"/>
-              <w:end w:w="140" w:type="dxa"/>
-            </w:tcMar>
-            <w:tcBorders>
-              <w:top w:val="single" w:sz="6" w:color="D9D9D9"/>
-              <w:left w:val="single" w:sz="6" w:color="D9D9D9"/>
-              <w:bottom w:val="single" w:sz="6" w:color="D9D9D9"/>
-              <w:right w:val="single" w:sz="6" w:color="D9D9D9"/>
-            </w:tcBorders>
-          </w:tcPr>
-          <w:p>
-            <w:pPr>
-              <w:spacing w:after="0" w:before="0"/>
-              <w:jc w:val="center"/>
-            </w:pPr>
-            <w:r>
-              <w:rPr>
-                <w:rFonts w:ascii="Arial" w:hAnsi="Arial"/>
-                <w:b w:val="0"/>
-                <w:color w:val="000000"/>
-                <w:sz w:val="21"/>
-              </w:rPr>
-              <w:t>5</w:t>
-            </w:r>
-          </w:p>
-        </w:tc>
-        <w:tc>
-          <w:tcPr>
-            <w:tcW w:type="dxa" w:w="3969"/>
-            <w:vAlign w:val="center"/>
-            <w:tcMar>
-              <w:top w:w="120" w:type="dxa"/>
-              <w:start w:w="140" w:type="dxa"/>
-              <w:bottom w:w="120" w:type="dxa"/>
-              <w:end w:w="140" w:type="dxa"/>
-            </w:tcMar>
-            <w:tcBorders>
-              <w:top w:val="single" w:sz="6" w:color="D9D9D9"/>
-              <w:left w:val="single" w:sz="6" w:color="D9D9D9"/>
-              <w:bottom w:val="single" w:sz="6" w:color="D9D9D9"/>
-              <w:right w:val="single" w:sz="6" w:color="D9D9D9"/>
-            </w:tcBorders>
-          </w:tcPr>
-          <w:p>
-            <w:pPr>
-              <w:spacing w:after="0" w:before="0"/>
-            </w:pPr>
-            <w:r>
-              <w:rPr>
-                <w:rFonts w:ascii="Arial" w:hAnsi="Arial"/>
-                <w:b w:val="0"/>
-                <w:color w:val="000000"/>
-                <w:sz w:val="21"/>
-              </w:rPr>
-              <w:t>Quando terminar de enviar tudo, escreva PODE ORGANIZAR.</w:t>
-            </w:r>
-          </w:p>
-        </w:tc>
-        <w:tc>
-          <w:tcPr>
-            <w:tcW w:type="dxa" w:w="3969"/>
-            <w:vAlign w:val="center"/>
-            <w:tcMar>
-              <w:top w:w="120" w:type="dxa"/>
-              <w:start w:w="140" w:type="dxa"/>
-              <w:bottom w:w="120" w:type="dxa"/>
-              <w:end w:w="140" w:type="dxa"/>
-            </w:tcMar>
-            <w:tcBorders>
-              <w:top w:val="single" w:sz="6" w:color="D9D9D9"/>
-              <w:left w:val="single" w:sz="6" w:color="D9D9D9"/>
-              <w:bottom w:val="single" w:sz="6" w:color="D9D9D9"/>
-              <w:right w:val="single" w:sz="6" w:color="D9D9D9"/>
-            </w:tcBorders>
-          </w:tcPr>
-          <w:p>
-            <w:pPr>
-              <w:spacing w:after="0" w:before="0"/>
-            </w:pPr>
-            <w:r>
-              <w:rPr>
-                <w:rFonts w:ascii="Arial" w:hAnsi="Arial"/>
-                <w:b w:val="0"/>
-                <w:color w:val="000000"/>
-                <w:sz w:val="21"/>
-              </w:rPr>
-              <w:t>Índice, cronologia, provas identificadas, transcrições e pendências.</w:t>
-            </w:r>
-          </w:p>
-        </w:tc>
-      </w:tr>
-      <w:tr>
-        <w:tc>
-          <w:tcPr>
-            <w:tcW w:type="dxa" w:w="737"/>
-            <w:vAlign w:val="center"/>
-            <w:tcMar>
-              <w:top w:w="120" w:type="dxa"/>
-              <w:start w:w="140" w:type="dxa"/>
-              <w:bottom w:w="120" w:type="dxa"/>
-              <w:end w:w="140" w:type="dxa"/>
-            </w:tcMar>
-            <w:tcBorders>
-              <w:top w:val="single" w:sz="6" w:color="D9D9D9"/>
-              <w:left w:val="single" w:sz="6" w:color="D9D9D9"/>
-              <w:bottom w:val="single" w:sz="6" w:color="D9D9D9"/>
-              <w:right w:val="single" w:sz="6" w:color="D9D9D9"/>
-            </w:tcBorders>
-            <w:shd w:fill="F7F3F0"/>
-          </w:tcPr>
-          <w:p>
-            <w:pPr>
-              <w:spacing w:after="0" w:before="0"/>
-              <w:jc w:val="center"/>
-            </w:pPr>
-            <w:r>
-              <w:rPr>
-                <w:rFonts w:ascii="Arial" w:hAnsi="Arial"/>
-                <w:b w:val="0"/>
-                <w:color w:val="000000"/>
-                <w:sz w:val="21"/>
-              </w:rPr>
-              <w:t>6</w:t>
-            </w:r>
-          </w:p>
-        </w:tc>
-        <w:tc>
-          <w:tcPr>
-            <w:tcW w:type="dxa" w:w="3969"/>
-            <w:vAlign w:val="center"/>
-            <w:tcMar>
-              <w:top w:w="120" w:type="dxa"/>
-              <w:start w:w="140" w:type="dxa"/>
-              <w:bottom w:w="120" w:type="dxa"/>
-              <w:end w:w="140" w:type="dxa"/>
-            </w:tcMar>
-            <w:tcBorders>
-              <w:top w:val="single" w:sz="6" w:color="D9D9D9"/>
-              <w:left w:val="single" w:sz="6" w:color="D9D9D9"/>
-              <w:bottom w:val="single" w:sz="6" w:color="D9D9D9"/>
-              <w:right w:val="single" w:sz="6" w:color="D9D9D9"/>
-            </w:tcBorders>
-            <w:shd w:fill="F7F3F0"/>
-          </w:tcPr>
-          <w:p>
-            <w:pPr>
-              <w:spacing w:after="0" w:before="0"/>
-            </w:pPr>
-            <w:r>
-              <w:rPr>
-                <w:rFonts w:ascii="Arial" w:hAnsi="Arial"/>
-                <w:b w:val="0"/>
-                <w:color w:val="000000"/>
-                <w:sz w:val="21"/>
-              </w:rPr>
-              <w:t>Leia o resumo e responda às perguntas que ficaram pendentes.</w:t>
-            </w:r>
-          </w:p>
-        </w:tc>
-        <w:tc>
-          <w:tcPr>
-            <w:tcW w:type="dxa" w:w="3969"/>
-            <w:vAlign w:val="center"/>
-            <w:tcMar>
-              <w:top w:w="120" w:type="dxa"/>
-              <w:start w:w="140" w:type="dxa"/>
-              <w:bottom w:w="120" w:type="dxa"/>
-              <w:end w:w="140" w:type="dxa"/>
-            </w:tcMar>
-            <w:tcBorders>
-              <w:top w:val="single" w:sz="6" w:color="D9D9D9"/>
-              <w:left w:val="single" w:sz="6" w:color="D9D9D9"/>
-              <w:bottom w:val="single" w:sz="6" w:color="D9D9D9"/>
-              <w:right w:val="single" w:sz="6" w:color="D9D9D9"/>
-            </w:tcBorders>
-            <w:shd w:fill="F7F3F0"/>
-          </w:tcPr>
-          <w:p>
-            <w:pPr>
-              <w:spacing w:after="0" w:before="0"/>
-            </w:pPr>
-            <w:r>
-              <w:rPr>
-                <w:rFonts w:ascii="Arial" w:hAnsi="Arial"/>
-                <w:b w:val="0"/>
-                <w:color w:val="000000"/>
-                <w:sz w:val="21"/>
-              </w:rPr>
-              <w:t>Contexto completo para análise e redação.</w:t>
-            </w:r>
-          </w:p>
-        </w:tc>
-      </w:tr>
-    </w:tbl>
-    <w:p>
-      <w:pPr>
-        <w:keepNext/>
-        <w:spacing w:before="280" w:after="120"/>
-      </w:pPr>
-      <w:r>
-        <w:rPr>
-          <w:rFonts w:ascii="Arial" w:hAnsi="Arial"/>
-          <w:b/>
-          <w:color w:val="000000"/>
-          <w:sz w:val="28"/>
-        </w:rPr>
-        <w:t>Frase para abrir um caso</w:t>
-      </w:r>
-    </w:p>
-    <w:p>
-      <w:pPr>
-        <w:spacing w:before="40" w:after="140" w:line="264" w:lineRule="auto"/>
-        <w:ind w:left="312" w:right="312"/>
-      </w:pPr>
-      <w:r>
-        <w:rPr>
-          <w:rFonts w:ascii="Courier New" w:hAnsi="Courier New"/>
-          <w:color w:val="000000"/>
-          <w:sz w:val="21"/>
-        </w:rPr>
-        <w:t>Quero abrir e organizar um novo caso jurídico.</w:t>
-      </w:r>
-    </w:p>
-    <w:p>
-      <w:pPr>
-        <w:keepNext/>
-        <w:spacing w:before="280" w:after="120"/>
-      </w:pPr>
-      <w:r>
-        <w:rPr>
-          <w:rFonts w:ascii="Arial" w:hAnsi="Arial"/>
-          <w:b/>
-          <w:color w:val="000000"/>
-          <w:sz w:val="28"/>
-        </w:rPr>
-        <w:t>Como exportar o WhatsApp</w:t>
+        <w:t>Este é o caminho recomendado para vários advogados. Somente o administrador faz a importação. Depois, cada advogado instala ou recebe o plug-in conforme a política escolhida pelo escritório.</w:t>
       </w:r>
     </w:p>
     <w:p>
@@ -973,14 +410,14 @@
           <w:b/>
           <w:sz w:val="22"/>
         </w:rPr>
-        <w:t>Abra a conversa</w:t>
+        <w:t>Abra a Administração</w:t>
       </w:r>
       <w:r>
         <w:rPr>
           <w:rFonts w:ascii="Arial" w:hAnsi="Arial"/>
           <w:sz w:val="22"/>
         </w:rPr>
-        <w:t>: no WhatsApp.</w:t>
+        <w:t>: entre em Plug-ins e escolha Adicionar e Importar marketplace.</w:t>
       </w:r>
     </w:p>
     <w:p>
@@ -1001,14 +438,14 @@
           <w:b/>
           <w:sz w:val="22"/>
         </w:rPr>
-        <w:t>Abra o menu</w:t>
+        <w:t>Cole o link oficial</w:t>
       </w:r>
       <w:r>
         <w:rPr>
           <w:rFonts w:ascii="Arial" w:hAnsi="Arial"/>
           <w:sz w:val="22"/>
         </w:rPr>
-        <w:t>: e escolha Mais ou Exportar conversa, conforme o aparelho.</w:t>
+        <w:t>: no campo Origem.</w:t>
       </w:r>
     </w:p>
     <w:p>
@@ -1029,14 +466,14 @@
           <w:b/>
           <w:sz w:val="22"/>
         </w:rPr>
-        <w:t>Escolha incluir mídias</w:t>
+        <w:t>Deixe Caminho vazio</w:t>
       </w:r>
       <w:r>
         <w:rPr>
           <w:rFonts w:ascii="Arial" w:hAnsi="Arial"/>
           <w:sz w:val="22"/>
         </w:rPr>
-        <w:t>: para preservar imagens, áudios e vídeos junto com a conversa.</w:t>
+        <w:t>: porque o arquivo do marketplace já está na raiz do repositório.</w:t>
       </w:r>
     </w:p>
     <w:p>
@@ -1057,14 +494,113 @@
           <w:b/>
           <w:sz w:val="22"/>
         </w:rPr>
-        <w:t>Guarde o arquivo ZIP</w:t>
+        <w:t>Deixe Branch tag ou commit vazio</w:t>
       </w:r>
       <w:r>
         <w:rPr>
           <w:rFonts w:ascii="Arial" w:hAnsi="Arial"/>
           <w:sz w:val="22"/>
         </w:rPr>
-        <w:t>: sem renomear ou retirar arquivos de dentro dele.</w:t>
+        <w:t>: para acompanhar a versão principal e receber as atualizações futuras.</w:t>
+      </w:r>
+    </w:p>
+    <w:p>
+      <w:pPr>
+        <w:spacing w:before="80" w:after="100" w:line="276" w:lineRule="auto"/>
+      </w:pPr>
+      <w:r>
+        <w:rPr>
+          <w:rFonts w:ascii="Arial" w:hAnsi="Arial"/>
+          <w:b/>
+          <w:sz w:val="22"/>
+        </w:rPr>
+        <w:t xml:space="preserve">5. </w:t>
+      </w:r>
+      <w:r>
+        <w:rPr>
+          <w:rFonts w:ascii="Arial" w:hAnsi="Arial"/>
+          <w:b/>
+          <w:sz w:val="22"/>
+        </w:rPr>
+        <w:t>Clique em Importar marketplace</w:t>
+      </w:r>
+      <w:r>
+        <w:rPr>
+          <w:rFonts w:ascii="Arial" w:hAnsi="Arial"/>
+          <w:sz w:val="22"/>
+        </w:rPr>
+        <w:t>: e autorize o acesso ao GitHub quando aparecer.</w:t>
+      </w:r>
+    </w:p>
+    <w:p>
+      <w:pPr>
+        <w:spacing w:before="80" w:after="100" w:line="276" w:lineRule="auto"/>
+      </w:pPr>
+      <w:r>
+        <w:rPr>
+          <w:rFonts w:ascii="Arial" w:hAnsi="Arial"/>
+          <w:b/>
+          <w:sz w:val="22"/>
+        </w:rPr>
+        <w:t xml:space="preserve">6. </w:t>
+      </w:r>
+      <w:r>
+        <w:rPr>
+          <w:rFonts w:ascii="Arial" w:hAnsi="Arial"/>
+          <w:b/>
+          <w:sz w:val="22"/>
+        </w:rPr>
+        <w:t>Abra o plug-in SA Fluxo Jurídico</w:t>
+      </w:r>
+      <w:r>
+        <w:rPr>
+          <w:rFonts w:ascii="Arial" w:hAnsi="Arial"/>
+          <w:sz w:val="22"/>
+        </w:rPr>
+        <w:t>: e escolha a política Instalado para os advogados que devem recebê-lo automaticamente.</w:t>
+      </w:r>
+    </w:p>
+    <w:p>
+      <w:pPr>
+        <w:spacing w:before="80" w:after="100" w:line="276" w:lineRule="auto"/>
+      </w:pPr>
+      <w:r>
+        <w:rPr>
+          <w:rFonts w:ascii="Arial" w:hAnsi="Arial"/>
+          <w:b/>
+          <w:sz w:val="22"/>
+        </w:rPr>
+        <w:t xml:space="preserve">7. </w:t>
+      </w:r>
+      <w:r>
+        <w:rPr>
+          <w:rFonts w:ascii="Arial" w:hAnsi="Arial"/>
+          <w:b/>
+          <w:sz w:val="22"/>
+        </w:rPr>
+        <w:t>Abra um novo chat</w:t>
+      </w:r>
+      <w:r>
+        <w:rPr>
+          <w:rFonts w:ascii="Arial" w:hAnsi="Arial"/>
+          <w:sz w:val="22"/>
+        </w:rPr>
+        <w:t>: e peça a tarefa normalmente.</w:t>
+      </w:r>
+    </w:p>
+    <w:p>
+      <w:pPr>
+        <w:spacing w:before="60" w:after="160" w:line="276" w:lineRule="auto"/>
+      </w:pPr>
+      <w:r>
+        <w:rPr>
+          <w:rFonts w:ascii="Arial" w:hAnsi="Arial"/>
+          <w:b/>
+          <w:i w:val="0"/>
+          <w:color w:val="000000"/>
+          <w:sz w:val="21"/>
+        </w:rPr>
+        <w:t>Se você não encontrar o menu Administração, peça esta instalação ao administrador da conta do escritório.</w:t>
       </w:r>
     </w:p>
     <w:p>
@@ -1079,7 +615,91 @@
           <w:color w:val="000000"/>
           <w:sz w:val="28"/>
         </w:rPr>
-        <w:t>Passo a passo para pedir uma peça jurídica</w:t>
+        <w:t>Codex</w:t>
+      </w:r>
+    </w:p>
+    <w:p>
+      <w:pPr>
+        <w:spacing w:before="0" w:after="160" w:line="276" w:lineRule="auto"/>
+      </w:pPr>
+      <w:r>
+        <w:rPr>
+          <w:rFonts w:ascii="Arial" w:hAnsi="Arial"/>
+          <w:b w:val="0"/>
+          <w:i w:val="0"/>
+          <w:color w:val="000000"/>
+          <w:sz w:val="22"/>
+        </w:rPr>
+        <w:t>O Codex é a opção mais prática para organizar uma pasta inteira de caso, converter arquivos, transcrever materiais e produzir documentos. Se o plug-in já foi liberado no workspace do ChatGPT, abra Plug-ins, instale SA Fluxo Jurídico e inicie uma nova tarefa. No Codex CLI, digite o comando abaixo para abrir o catálogo de plug-ins.</w:t>
+      </w:r>
+    </w:p>
+    <w:p>
+      <w:pPr>
+        <w:spacing w:before="40" w:after="140" w:line="264" w:lineRule="auto"/>
+        <w:ind w:left="312" w:right="312"/>
+      </w:pPr>
+      <w:r>
+        <w:rPr>
+          <w:rFonts w:ascii="Courier New" w:hAnsi="Courier New"/>
+          <w:color w:val="000000"/>
+          <w:sz w:val="21"/>
+        </w:rPr>
+        <w:t>/plugins</w:t>
+      </w:r>
+    </w:p>
+    <w:p>
+      <w:pPr>
+        <w:sectPr>
+          <w:pgSz w:w="11906" w:h="16838"/>
+          <w:pgMar w:top="2268" w:right="1134" w:bottom="1701" w:left="1701" w:header="0" w:footer="0" w:gutter="0"/>
+          <w:cols w:space="720"/>
+          <w:docGrid w:linePitch="360"/>
+        </w:sectPr>
+      </w:pPr>
+    </w:p>
+    <w:p>
+      <w:pPr>
+        <w:spacing w:before="0" w:after="920" w:line="276" w:lineRule="auto"/>
+      </w:pPr>
+      <w:r>
+        <w:rPr>
+          <w:rFonts w:ascii="Arial" w:hAnsi="Arial"/>
+          <w:b w:val="0"/>
+          <w:i w:val="0"/>
+          <w:color w:val="FFFFFF"/>
+          <w:sz w:val="2"/>
+        </w:rPr>
+        <w:t xml:space="preserve"> </w:t>
+      </w:r>
+    </w:p>
+    <w:p>
+      <w:pPr>
+        <w:keepNext/>
+        <w:spacing w:before="280" w:after="120"/>
+      </w:pPr>
+      <w:r>
+        <w:rPr>
+          <w:rFonts w:ascii="Arial" w:hAnsi="Arial"/>
+          <w:b/>
+          <w:color w:val="000000"/>
+          <w:sz w:val="28"/>
+        </w:rPr>
+        <w:t>Claude no navegador</w:t>
+      </w:r>
+    </w:p>
+    <w:p>
+      <w:pPr>
+        <w:spacing w:before="0" w:after="160" w:line="276" w:lineRule="auto"/>
+      </w:pPr>
+      <w:r>
+        <w:rPr>
+          <w:rFonts w:ascii="Arial" w:hAnsi="Arial"/>
+          <w:b w:val="0"/>
+          <w:i w:val="0"/>
+          <w:color w:val="000000"/>
+          <w:sz w:val="22"/>
+        </w:rPr>
+        <w:t>No Claude comum, use um Projeto conectado ao GitHub. Ele recebe as instruções do escritório, mas não substitui o Codex ou o Claude Code para trabalhar diretamente com uma pasta inteira do computador.</w:t>
       </w:r>
     </w:p>
     <w:p>
@@ -1100,14 +720,14 @@
           <w:b/>
           <w:sz w:val="22"/>
         </w:rPr>
-        <w:t>Aguarde a organização terminar</w:t>
+        <w:t>Crie um Projeto</w:t>
       </w:r>
       <w:r>
         <w:rPr>
           <w:rFonts w:ascii="Arial" w:hAnsi="Arial"/>
           <w:sz w:val="22"/>
         </w:rPr>
-        <w:t>: e leia o resumo, a cronologia e as pendências.</w:t>
+        <w:t>: com o nome Fluxo Jurídico SA Advocacia.</w:t>
       </w:r>
     </w:p>
     <w:p>
@@ -1128,14 +748,14 @@
           <w:b/>
           <w:sz w:val="22"/>
         </w:rPr>
-        <w:t>Informe o objetivo</w:t>
+        <w:t>Na área de conhecimento do Projeto</w:t>
       </w:r>
       <w:r>
         <w:rPr>
           <w:rFonts w:ascii="Arial" w:hAnsi="Arial"/>
           <w:sz w:val="22"/>
         </w:rPr>
-        <w:t>: por exemplo, petição inicial, contestação, réplica, acordo ou recurso.</w:t>
+        <w:t>: clique no sinal de mais e escolha GitHub.</w:t>
       </w:r>
     </w:p>
     <w:p>
@@ -1156,14 +776,14 @@
           <w:b/>
           <w:sz w:val="22"/>
         </w:rPr>
-        <w:t>Informe prazo, audiência ou urgência</w:t>
+        <w:t>Cole o link oficial</w:t>
       </w:r>
       <w:r>
         <w:rPr>
           <w:rFonts w:ascii="Arial" w:hAnsi="Arial"/>
           <w:sz w:val="22"/>
         </w:rPr>
-        <w:t>: se houver.</w:t>
+        <w:t>: autorize o GitHub e selecione os arquivos do repositório.</w:t>
       </w:r>
     </w:p>
     <w:p>
@@ -1184,14 +804,14 @@
           <w:b/>
           <w:sz w:val="22"/>
         </w:rPr>
-        <w:t>Peça a produção em Word</w:t>
+        <w:t>Quando o repositório for atualizado</w:t>
       </w:r>
       <w:r>
         <w:rPr>
           <w:rFonts w:ascii="Arial" w:hAnsi="Arial"/>
           <w:sz w:val="22"/>
         </w:rPr>
-        <w:t>: usando o caso já organizado.</w:t>
+        <w:t>: use Sincronizar antes de começar um trabalho novo.</w:t>
       </w:r>
     </w:p>
     <w:p>
@@ -1206,7 +826,22 @@
           <w:color w:val="000000"/>
           <w:sz w:val="28"/>
         </w:rPr>
-        <w:t>Frase para pedir uma peça</w:t>
+        <w:t>Claude Code</w:t>
+      </w:r>
+    </w:p>
+    <w:p>
+      <w:pPr>
+        <w:spacing w:before="0" w:after="160" w:line="276" w:lineRule="auto"/>
+      </w:pPr>
+      <w:r>
+        <w:rPr>
+          <w:rFonts w:ascii="Arial" w:hAnsi="Arial"/>
+          <w:b w:val="0"/>
+          <w:i w:val="0"/>
+          <w:color w:val="000000"/>
+          <w:sz w:val="22"/>
+        </w:rPr>
+        <w:t>Abra o Claude Code e envie os dois comandos abaixo, um de cada vez.</w:t>
       </w:r>
     </w:p>
     <w:p>
@@ -1220,12 +855,61 @@
           <w:color w:val="000000"/>
           <w:sz w:val="21"/>
         </w:rPr>
-        <w:t>Analise o caso organizado e produza a peça jurídica adequada em Word. Não invente informações. Antes de concluir, liste as pendências que dependem de confirmação da advogada.</w:t>
+        <w:t>/plugin marketplace add mix7producao/fluxo-juridico</w:t>
       </w:r>
     </w:p>
     <w:p>
+      <w:pPr>
+        <w:spacing w:before="40" w:after="140" w:line="264" w:lineRule="auto"/>
+        <w:ind w:left="312" w:right="312"/>
+      </w:pPr>
       <w:r>
-        <w:br w:type="page"/>
+        <w:rPr>
+          <w:rFonts w:ascii="Courier New" w:hAnsi="Courier New"/>
+          <w:color w:val="000000"/>
+          <w:sz w:val="21"/>
+        </w:rPr>
+        <w:t>/plugin install sa-fluxo-juridico@sa-advocacia</w:t>
+      </w:r>
+    </w:p>
+    <w:p>
+      <w:pPr>
+        <w:spacing w:before="0" w:after="160" w:line="276" w:lineRule="auto"/>
+      </w:pPr>
+      <w:r>
+        <w:rPr>
+          <w:rFonts w:ascii="Arial" w:hAnsi="Arial"/>
+          <w:b w:val="0"/>
+          <w:i w:val="0"/>
+          <w:color w:val="000000"/>
+          <w:sz w:val="22"/>
+        </w:rPr>
+        <w:t>Para receber atualizações automáticas, abra /plugin, entre em Marketplaces, escolha sa-advocacia e ative Enable auto-update. Se aparecer a mensagem para recarregar, use /reload-plugins.</w:t>
+      </w:r>
+    </w:p>
+    <w:p>
+      <w:pPr>
+        <w:sectPr>
+          <w:pgSz w:w="11906" w:h="16838"/>
+          <w:pgMar w:top="2268" w:right="1134" w:bottom="1701" w:left="1701" w:header="0" w:footer="0" w:gutter="0"/>
+          <w:cols w:space="720"/>
+          <w:docGrid w:linePitch="360"/>
+        </w:sectPr>
+      </w:pPr>
+    </w:p>
+    <w:p>
+      <w:pPr>
+        <w:spacing w:before="0" w:after="920" w:line="276" w:lineRule="auto"/>
+      </w:pPr>
+      <w:r>
+        <w:rPr>
+          <w:rFonts w:ascii="Arial" w:hAnsi="Arial"/>
+          <w:b w:val="0"/>
+          <w:i w:val="0"/>
+          <w:color w:val="FFFFFF"/>
+          <w:sz w:val="2"/>
+        </w:rPr>
+        <w:t xml:space="preserve"> </w:t>
       </w:r>
     </w:p>
     <w:p>
@@ -1240,7 +924,95 @@
           <w:color w:val="000000"/>
           <w:sz w:val="28"/>
         </w:rPr>
-        <w:t>O que a IA faz e o que a advogada confere</w:t>
+        <w:t>Como começar depois da instalação</w:t>
+      </w:r>
+    </w:p>
+    <w:p>
+      <w:pPr>
+        <w:spacing w:before="0" w:after="40" w:line="276" w:lineRule="auto"/>
+      </w:pPr>
+      <w:r>
+        <w:rPr>
+          <w:rFonts w:ascii="Arial" w:hAnsi="Arial"/>
+          <w:b w:val="0"/>
+          <w:i w:val="0"/>
+          <w:color w:val="000000"/>
+          <w:sz w:val="22"/>
+        </w:rPr>
+        <w:t>Para organizar um caso, coloque todos os arquivos na pasta do caso e use a frase abaixo.</w:t>
+      </w:r>
+    </w:p>
+    <w:p>
+      <w:pPr>
+        <w:spacing w:before="40" w:after="140" w:line="264" w:lineRule="auto"/>
+        <w:ind w:left="312" w:right="312"/>
+      </w:pPr>
+      <w:r>
+        <w:rPr>
+          <w:rFonts w:ascii="Courier New" w:hAnsi="Courier New"/>
+          <w:color w:val="000000"/>
+          <w:sz w:val="21"/>
+        </w:rPr>
+        <w:t>Quero abrir e organizar um novo caso jurídico.</w:t>
+      </w:r>
+    </w:p>
+    <w:p>
+      <w:pPr>
+        <w:spacing w:before="0" w:after="160" w:line="276" w:lineRule="auto"/>
+      </w:pPr>
+      <w:r>
+        <w:rPr>
+          <w:rFonts w:ascii="Arial" w:hAnsi="Arial"/>
+          <w:b w:val="0"/>
+          <w:i w:val="0"/>
+          <w:color w:val="000000"/>
+          <w:sz w:val="22"/>
+        </w:rPr>
+        <w:t>A ferramenta primeiro lembrará o que pode estar faltando. Quando você confirmar que terminou de enviar, ela preservará os originais e começará a organização.</w:t>
+      </w:r>
+    </w:p>
+    <w:p>
+      <w:pPr>
+        <w:spacing w:before="0" w:after="40" w:line="276" w:lineRule="auto"/>
+      </w:pPr>
+      <w:r>
+        <w:rPr>
+          <w:rFonts w:ascii="Arial" w:hAnsi="Arial"/>
+          <w:b w:val="0"/>
+          <w:i w:val="0"/>
+          <w:color w:val="000000"/>
+          <w:sz w:val="22"/>
+        </w:rPr>
+        <w:t>Depois que o caso estiver organizado, use a frase abaixo para produzir a peça.</w:t>
+      </w:r>
+    </w:p>
+    <w:p>
+      <w:pPr>
+        <w:spacing w:before="40" w:after="140" w:line="264" w:lineRule="auto"/>
+        <w:ind w:left="312" w:right="312"/>
+      </w:pPr>
+      <w:r>
+        <w:rPr>
+          <w:rFonts w:ascii="Courier New" w:hAnsi="Courier New"/>
+          <w:color w:val="000000"/>
+          <w:sz w:val="21"/>
+        </w:rPr>
+        <w:t>Analise o caso organizado e produza a peça jurídica adequada em Word. Não invente informações e liste tudo que ainda depende de confirmação.</w:t>
+      </w:r>
+    </w:p>
+    <w:p>
+      <w:pPr>
+        <w:keepNext/>
+        <w:spacing w:before="280" w:after="120"/>
+      </w:pPr>
+      <w:r>
+        <w:rPr>
+          <w:rFonts w:ascii="Arial" w:hAnsi="Arial"/>
+          <w:b/>
+          <w:color w:val="000000"/>
+          <w:sz w:val="28"/>
+        </w:rPr>
+        <w:t>Como a peça em Word será entregue</w:t>
       </w:r>
     </w:p>
     <w:tbl>
@@ -1286,7 +1058,7 @@
                 <w:color w:val="000000"/>
                 <w:sz w:val="21"/>
               </w:rPr>
-              <w:t>A IA prepara</w:t>
+              <w:t>O pacote prepara</w:t>
             </w:r>
           </w:p>
         </w:tc>
@@ -1319,7 +1091,7 @@
                 <w:color w:val="000000"/>
                 <w:sz w:val="21"/>
               </w:rPr>
-              <w:t>A advogada confere</w:t>
+              <w:t>A advogada revisa</w:t>
             </w:r>
           </w:p>
         </w:tc>
@@ -1353,7 +1125,7 @@
                 <w:color w:val="000000"/>
                 <w:sz w:val="21"/>
               </w:rPr>
-              <w:t>Organização, índices, transcrições e cronologia.</w:t>
+              <w:t>Arquivo editável em Word no papel timbrado oficial.</w:t>
             </w:r>
           </w:p>
         </w:tc>
@@ -1385,7 +1157,7 @@
                 <w:color w:val="000000"/>
                 <w:sz w:val="21"/>
               </w:rPr>
-              <w:t>Se todos os documentos importantes foram recebidos.</w:t>
+              <w:t>Se o timbrado correto foi usado para aquele escritório.</w:t>
             </w:r>
           </w:p>
         </w:tc>
@@ -1420,7 +1192,7 @@
                 <w:color w:val="000000"/>
                 <w:sz w:val="21"/>
               </w:rPr>
-              <w:t>Rascunho da peça, estrutura, formatação e relação entre fatos e provas.</w:t>
+              <w:t>Formatação, cores e estrutura definidas nas instruções do escritório.</w:t>
             </w:r>
           </w:p>
         </w:tc>
@@ -1453,7 +1225,7 @@
                 <w:color w:val="000000"/>
                 <w:sz w:val="21"/>
               </w:rPr>
-              <w:t>Estratégia, fatos, pedidos, valores, prazos e documentos anexados.</w:t>
+              <w:t>Estratégia, fatos, pedidos, valores, prazos e anexos.</w:t>
             </w:r>
           </w:p>
         </w:tc>
@@ -1487,7 +1259,7 @@
                 <w:color w:val="000000"/>
                 <w:sz w:val="21"/>
               </w:rPr>
-              <w:t>Uso de uma cópia do papel timbrado oficial e revisão visual do Word.</w:t>
+              <w:t>Indicação clara do que está comprovado e do que precisa ser confirmado.</w:t>
             </w:r>
           </w:p>
         </w:tc>
@@ -1556,7 +1328,6 @@
       </w:r>
     </w:p>
     <w:sectPr>
-      <w:headerReference w:type="default" r:id="rId8"/>
       <w:pgSz w:w="11906" w:h="16838"/>
       <w:pgMar w:top="2268" w:right="1134" w:bottom="1701" w:left="1701" w:header="0" w:footer="0" w:gutter="0"/>
       <w:cols w:space="720"/>
@@ -2606,15 +2377,12 @@
     <w:qFormat/>
     <w:rsid w:val="00FC693F"/>
     <w:pPr>
-      <w:pBdr>
-        <w:bottom w:val="single" w:sz="8" w:space="4" w:color="4F81BD" w:themeColor="accent1"/>
-      </w:pBdr>
       <w:spacing w:after="300" w:line="240" w:lineRule="auto"/>
       <w:contextualSpacing/>
     </w:pPr>
     <w:rPr>
       <w:rFonts w:asciiTheme="majorHAnsi" w:eastAsiaTheme="majorEastAsia" w:hAnsiTheme="majorHAnsi" w:cstheme="majorBidi"/>
-      <w:color w:val="17365D" w:themeColor="text2" w:themeShade="BF"/>
+      <w:color w:val="000000"/>
       <w:spacing w:val="5"/>
       <w:kern w:val="28"/>
       <w:sz w:val="52"/>

</xml_diff>

<commit_message>
Atualiza manual para contas pessoais
</commit_message>
<xml_diff>
--- a/guias/MANUAL-DO-ADVOGADO-FLUXO-JURIDICO-SA-ADVOCACIA.docx
+++ b/guias/MANUAL-DO-ADVOGADO-FLUXO-JURIDICO-SA-ADVOCACIA.docx
@@ -28,9 +28,9 @@
           <w:b/>
           <w:i w:val="0"/>
           <w:color w:val="000000"/>
-          <w:sz w:val="44"/>
+          <w:sz w:val="42"/>
         </w:rPr>
-        <w:t>Manual de instalação do Fluxo Jurídico</w:t>
+        <w:t>Guia de instalação no ChatGPT e Claude pessoais</w:t>
       </w:r>
     </w:p>
     <w:p>
@@ -45,7 +45,7 @@
           <w:color w:val="595959"/>
           <w:sz w:val="24"/>
         </w:rPr>
-        <w:t>Como usar no ChatGPT Codex Claude e Claude Code</w:t>
+        <w:t>Primeiro instale. Depois veja para que serve e como usar.</w:t>
       </w:r>
     </w:p>
     <w:p>
@@ -60,7 +60,7 @@
           <w:color w:val="000000"/>
           <w:sz w:val="22"/>
         </w:rPr>
-        <w:t>Este manual ensina como instalar e usar o pacote de trabalho jurídico da Sousa Araújo Advocacia. Você não precisa entender programação. Escolha abaixo a ferramenta que já utiliza e siga somente aquele caminho.</w:t>
+        <w:t>Este guia é para contas pessoais do ChatGPT e do Claude. Não exige conta Business, programação ou conhecimento técnico.</w:t>
       </w:r>
     </w:p>
     <w:p>
@@ -75,52 +75,7 @@
           <w:color w:val="000000"/>
           <w:sz w:val="28"/>
         </w:rPr>
-        <w:t>Link oficial para copiar</w:t>
-      </w:r>
-    </w:p>
-    <w:p>
-      <w:pPr>
-        <w:spacing w:before="0" w:after="40" w:line="276" w:lineRule="auto"/>
-      </w:pPr>
-      <w:r>
-        <w:rPr>
-          <w:rFonts w:ascii="Arial" w:hAnsi="Arial"/>
-          <w:b w:val="0"/>
-          <w:i w:val="0"/>
-          <w:color w:val="000000"/>
-          <w:sz w:val="22"/>
-        </w:rPr>
-        <w:t>Copie o endereço abaixo exatamente como está.</w:t>
-      </w:r>
-    </w:p>
-    <w:p>
-      <w:pPr>
-        <w:keepNext/>
-        <w:spacing w:before="60" w:after="200"/>
-      </w:pPr>
-      <w:hyperlink r:id="rId11">
-        <w:r>
-          <w:rPr>
-            <w:color w:val="0563C1"/>
-            <w:u w:val="single"/>
-          </w:rPr>
-          <w:t>https://github.com/mix7producao/fluxo-juridico</w:t>
-        </w:r>
-      </w:hyperlink>
-    </w:p>
-    <w:p>
-      <w:pPr>
-        <w:keepNext/>
-        <w:spacing w:before="280" w:after="120"/>
-      </w:pPr>
-      <w:r>
-        <w:rPr>
-          <w:rFonts w:ascii="Arial" w:hAnsi="Arial"/>
-          <w:b/>
-          <w:color w:val="000000"/>
-          <w:sz w:val="28"/>
-        </w:rPr>
-        <w:t>O que o pacote faz</w:t>
+        <w:t>Tenha estes dois arquivos em mãos</w:t>
       </w:r>
     </w:p>
     <w:p>
@@ -142,7 +97,7 @@
           <w:color w:val="000000"/>
           <w:sz w:val="22"/>
         </w:rPr>
-        <w:t>Organiza processos, documentos, conversas, áudios, vídeos e demais provas sem alterar os originais.</w:t>
+        <w:t>PACOTE-UNICO-PARA-CHATGPT-E-CLAUDE.md</w:t>
       </w:r>
     </w:p>
     <w:p>
@@ -164,7 +119,626 @@
           <w:color w:val="000000"/>
           <w:sz w:val="22"/>
         </w:rPr>
-        <w:t>Cria índice, linha do tempo, resumo, perguntas pendentes e identificação permanente das provas, como PROVA-0001.</w:t>
+        <w:t>PAPEL-TIMBRADO-OFICIAL-SA-ADVOCACIA.docx</w:t>
+      </w:r>
+    </w:p>
+    <w:p>
+      <w:pPr>
+        <w:spacing w:before="0" w:after="200" w:line="276" w:lineRule="auto"/>
+      </w:pPr>
+      <w:r>
+        <w:rPr>
+          <w:rFonts w:ascii="Arial" w:hAnsi="Arial"/>
+          <w:b/>
+          <w:i w:val="0"/>
+          <w:color w:val="000000"/>
+          <w:sz w:val="21"/>
+        </w:rPr>
+        <w:t>Os dois arquivos são enviados junto com este manual. Não altere o conteúdo deles.</w:t>
+      </w:r>
+    </w:p>
+    <w:p>
+      <w:pPr>
+        <w:keepNext/>
+        <w:spacing w:before="280" w:after="120"/>
+      </w:pPr>
+      <w:r>
+        <w:rPr>
+          <w:rFonts w:ascii="Arial" w:hAnsi="Arial"/>
+          <w:b/>
+          <w:color w:val="000000"/>
+          <w:sz w:val="28"/>
+        </w:rPr>
+        <w:t>Instalação no ChatGPT pessoal</w:t>
+      </w:r>
+    </w:p>
+    <w:p>
+      <w:pPr>
+        <w:spacing w:before="80" w:after="100" w:line="276" w:lineRule="auto"/>
+      </w:pPr>
+      <w:r>
+        <w:rPr>
+          <w:rFonts w:ascii="Arial" w:hAnsi="Arial"/>
+          <w:b/>
+          <w:sz w:val="22"/>
+        </w:rPr>
+        <w:t xml:space="preserve">1. </w:t>
+      </w:r>
+      <w:r>
+        <w:rPr>
+          <w:rFonts w:ascii="Arial" w:hAnsi="Arial"/>
+          <w:b/>
+          <w:sz w:val="22"/>
+        </w:rPr>
+        <w:t>Entre no ChatGPT</w:t>
+      </w:r>
+      <w:r>
+        <w:rPr>
+          <w:rFonts w:ascii="Arial" w:hAnsi="Arial"/>
+          <w:sz w:val="22"/>
+        </w:rPr>
+        <w:t>: com sua conta pessoal.</w:t>
+      </w:r>
+    </w:p>
+    <w:p>
+      <w:pPr>
+        <w:spacing w:before="80" w:after="100" w:line="276" w:lineRule="auto"/>
+      </w:pPr>
+      <w:r>
+        <w:rPr>
+          <w:rFonts w:ascii="Arial" w:hAnsi="Arial"/>
+          <w:b/>
+          <w:sz w:val="22"/>
+        </w:rPr>
+        <w:t xml:space="preserve">2. </w:t>
+      </w:r>
+      <w:r>
+        <w:rPr>
+          <w:rFonts w:ascii="Arial" w:hAnsi="Arial"/>
+          <w:b/>
+          <w:sz w:val="22"/>
+        </w:rPr>
+        <w:t>Proteja os dados dos clientes</w:t>
+      </w:r>
+      <w:r>
+        <w:rPr>
+          <w:rFonts w:ascii="Arial" w:hAnsi="Arial"/>
+          <w:sz w:val="22"/>
+        </w:rPr>
+        <w:t>: clique na sua foto, abra Configurações e Controles de dados e desative Melhorar o modelo para todos.</w:t>
+      </w:r>
+    </w:p>
+    <w:p>
+      <w:pPr>
+        <w:spacing w:before="80" w:after="100" w:line="276" w:lineRule="auto"/>
+      </w:pPr>
+      <w:r>
+        <w:rPr>
+          <w:rFonts w:ascii="Arial" w:hAnsi="Arial"/>
+          <w:b/>
+          <w:sz w:val="22"/>
+        </w:rPr>
+        <w:t xml:space="preserve">3. </w:t>
+      </w:r>
+      <w:r>
+        <w:rPr>
+          <w:rFonts w:ascii="Arial" w:hAnsi="Arial"/>
+          <w:b/>
+          <w:sz w:val="22"/>
+        </w:rPr>
+        <w:t>Clique em Novo projeto</w:t>
+      </w:r>
+      <w:r>
+        <w:rPr>
+          <w:rFonts w:ascii="Arial" w:hAnsi="Arial"/>
+          <w:sz w:val="22"/>
+        </w:rPr>
+        <w:t>: na barra lateral.</w:t>
+      </w:r>
+    </w:p>
+    <w:p>
+      <w:pPr>
+        <w:spacing w:before="80" w:after="100" w:line="276" w:lineRule="auto"/>
+      </w:pPr>
+      <w:r>
+        <w:rPr>
+          <w:rFonts w:ascii="Arial" w:hAnsi="Arial"/>
+          <w:b/>
+          <w:sz w:val="22"/>
+        </w:rPr>
+        <w:t xml:space="preserve">4. </w:t>
+      </w:r>
+      <w:r>
+        <w:rPr>
+          <w:rFonts w:ascii="Arial" w:hAnsi="Arial"/>
+          <w:b/>
+          <w:sz w:val="22"/>
+        </w:rPr>
+        <w:t>Dê um nome ao projeto</w:t>
+      </w:r>
+      <w:r>
+        <w:rPr>
+          <w:rFonts w:ascii="Arial" w:hAnsi="Arial"/>
+          <w:sz w:val="22"/>
+        </w:rPr>
+        <w:t>: por exemplo, CASO 2026-001.</w:t>
+      </w:r>
+    </w:p>
+    <w:p>
+      <w:pPr>
+        <w:spacing w:before="80" w:after="100" w:line="276" w:lineRule="auto"/>
+      </w:pPr>
+      <w:r>
+        <w:rPr>
+          <w:rFonts w:ascii="Arial" w:hAnsi="Arial"/>
+          <w:b/>
+          <w:sz w:val="22"/>
+        </w:rPr>
+        <w:t xml:space="preserve">5. </w:t>
+      </w:r>
+      <w:r>
+        <w:rPr>
+          <w:rFonts w:ascii="Arial" w:hAnsi="Arial"/>
+          <w:b/>
+          <w:sz w:val="22"/>
+        </w:rPr>
+        <w:t>Adicione os dois arquivos</w:t>
+      </w:r>
+      <w:r>
+        <w:rPr>
+          <w:rFonts w:ascii="Arial" w:hAnsi="Arial"/>
+          <w:sz w:val="22"/>
+        </w:rPr>
+        <w:t>: use Adicionar arquivos ou Adicionar fonte e selecione o pacote e o papel timbrado.</w:t>
+      </w:r>
+    </w:p>
+    <w:p>
+      <w:pPr>
+        <w:spacing w:before="80" w:after="100" w:line="276" w:lineRule="auto"/>
+      </w:pPr>
+      <w:r>
+        <w:rPr>
+          <w:rFonts w:ascii="Arial" w:hAnsi="Arial"/>
+          <w:b/>
+          <w:sz w:val="22"/>
+        </w:rPr>
+        <w:t xml:space="preserve">6. </w:t>
+      </w:r>
+      <w:r>
+        <w:rPr>
+          <w:rFonts w:ascii="Arial" w:hAnsi="Arial"/>
+          <w:b/>
+          <w:sz w:val="22"/>
+        </w:rPr>
+        <w:t>Abra as configurações do projeto</w:t>
+      </w:r>
+      <w:r>
+        <w:rPr>
+          <w:rFonts w:ascii="Arial" w:hAnsi="Arial"/>
+          <w:sz w:val="22"/>
+        </w:rPr>
+        <w:t>: e cole a instrução abaixo no campo Instruções do projeto.</w:t>
+      </w:r>
+    </w:p>
+    <w:p>
+      <w:pPr>
+        <w:spacing w:before="40" w:after="140" w:line="264" w:lineRule="auto"/>
+        <w:ind w:left="312" w:right="312"/>
+      </w:pPr>
+      <w:r>
+        <w:rPr>
+          <w:rFonts w:ascii="Courier New" w:hAnsi="Courier New"/>
+          <w:color w:val="000000"/>
+          <w:sz w:val="21"/>
+        </w:rPr>
+        <w:t>Leia e siga integralmente o arquivo PACOTE-UNICO-PARA-CHATGPT-E-CLAUDE.md. Use o papel timbrado oficial nas peças em Word. Nunca invente informações.</w:t>
+      </w:r>
+    </w:p>
+    <w:p>
+      <w:pPr>
+        <w:spacing w:before="80" w:after="100" w:line="276" w:lineRule="auto"/>
+      </w:pPr>
+      <w:r>
+        <w:rPr>
+          <w:rFonts w:ascii="Arial" w:hAnsi="Arial"/>
+          <w:b/>
+          <w:sz w:val="22"/>
+        </w:rPr>
+        <w:t xml:space="preserve">7. </w:t>
+      </w:r>
+      <w:r>
+        <w:rPr>
+          <w:rFonts w:ascii="Arial" w:hAnsi="Arial"/>
+          <w:b/>
+          <w:sz w:val="22"/>
+        </w:rPr>
+        <w:t>Inicie um novo chat dentro do projeto</w:t>
+      </w:r>
+      <w:r>
+        <w:rPr>
+          <w:rFonts w:ascii="Arial" w:hAnsi="Arial"/>
+          <w:sz w:val="22"/>
+        </w:rPr>
+        <w:t>: e use a frase de teste abaixo.</w:t>
+      </w:r>
+    </w:p>
+    <w:p>
+      <w:pPr>
+        <w:spacing w:before="40" w:after="140" w:line="264" w:lineRule="auto"/>
+        <w:ind w:left="312" w:right="312"/>
+      </w:pPr>
+      <w:r>
+        <w:rPr>
+          <w:rFonts w:ascii="Courier New" w:hAnsi="Courier New"/>
+          <w:color w:val="000000"/>
+          <w:sz w:val="21"/>
+        </w:rPr>
+        <w:t>Confirme que leu as instruções da SA Advocacia e diga, em poucas linhas, quais tarefas pode realizar.</w:t>
+      </w:r>
+    </w:p>
+    <w:p>
+      <w:pPr>
+        <w:sectPr>
+          <w:headerReference w:type="default" r:id="rId8"/>
+          <w:pgSz w:w="11906" w:h="16838"/>
+          <w:pgMar w:top="2268" w:right="1134" w:bottom="1701" w:left="1701" w:header="0" w:footer="0" w:gutter="0"/>
+          <w:cols w:space="720"/>
+          <w:docGrid w:linePitch="360"/>
+        </w:sectPr>
+      </w:pPr>
+    </w:p>
+    <w:p>
+      <w:pPr>
+        <w:spacing w:before="0" w:after="920" w:line="276" w:lineRule="auto"/>
+      </w:pPr>
+      <w:r>
+        <w:rPr>
+          <w:rFonts w:ascii="Arial" w:hAnsi="Arial"/>
+          <w:b w:val="0"/>
+          <w:i w:val="0"/>
+          <w:color w:val="FFFFFF"/>
+          <w:sz w:val="2"/>
+        </w:rPr>
+        <w:t xml:space="preserve"> </w:t>
+      </w:r>
+    </w:p>
+    <w:p>
+      <w:pPr>
+        <w:keepNext/>
+        <w:spacing w:before="280" w:after="120"/>
+      </w:pPr>
+      <w:r>
+        <w:rPr>
+          <w:rFonts w:ascii="Arial" w:hAnsi="Arial"/>
+          <w:b/>
+          <w:color w:val="000000"/>
+          <w:sz w:val="28"/>
+        </w:rPr>
+        <w:t>Instalação no Claude pessoal</w:t>
+      </w:r>
+    </w:p>
+    <w:p>
+      <w:pPr>
+        <w:spacing w:before="80" w:after="100" w:line="276" w:lineRule="auto"/>
+      </w:pPr>
+      <w:r>
+        <w:rPr>
+          <w:rFonts w:ascii="Arial" w:hAnsi="Arial"/>
+          <w:b/>
+          <w:sz w:val="22"/>
+        </w:rPr>
+        <w:t xml:space="preserve">1. </w:t>
+      </w:r>
+      <w:r>
+        <w:rPr>
+          <w:rFonts w:ascii="Arial" w:hAnsi="Arial"/>
+          <w:b/>
+          <w:sz w:val="22"/>
+        </w:rPr>
+        <w:t>Entre no Claude</w:t>
+      </w:r>
+      <w:r>
+        <w:rPr>
+          <w:rFonts w:ascii="Arial" w:hAnsi="Arial"/>
+          <w:sz w:val="22"/>
+        </w:rPr>
+        <w:t>: com sua conta pessoal e abra Projetos.</w:t>
+      </w:r>
+    </w:p>
+    <w:p>
+      <w:pPr>
+        <w:spacing w:before="80" w:after="100" w:line="276" w:lineRule="auto"/>
+      </w:pPr>
+      <w:r>
+        <w:rPr>
+          <w:rFonts w:ascii="Arial" w:hAnsi="Arial"/>
+          <w:b/>
+          <w:sz w:val="22"/>
+        </w:rPr>
+        <w:t xml:space="preserve">2. </w:t>
+      </w:r>
+      <w:r>
+        <w:rPr>
+          <w:rFonts w:ascii="Arial" w:hAnsi="Arial"/>
+          <w:b/>
+          <w:sz w:val="22"/>
+        </w:rPr>
+        <w:t>Proteja os dados dos clientes</w:t>
+      </w:r>
+      <w:r>
+        <w:rPr>
+          <w:rFonts w:ascii="Arial" w:hAnsi="Arial"/>
+          <w:sz w:val="22"/>
+        </w:rPr>
+        <w:t>: abra Configurações e Privacidade e deixe desativada qualquer opção que autorize o uso das conversas para melhorar o Claude.</w:t>
+      </w:r>
+    </w:p>
+    <w:p>
+      <w:pPr>
+        <w:spacing w:before="80" w:after="100" w:line="276" w:lineRule="auto"/>
+      </w:pPr>
+      <w:r>
+        <w:rPr>
+          <w:rFonts w:ascii="Arial" w:hAnsi="Arial"/>
+          <w:b/>
+          <w:sz w:val="22"/>
+        </w:rPr>
+        <w:t xml:space="preserve">3. </w:t>
+      </w:r>
+      <w:r>
+        <w:rPr>
+          <w:rFonts w:ascii="Arial" w:hAnsi="Arial"/>
+          <w:b/>
+          <w:sz w:val="22"/>
+        </w:rPr>
+        <w:t>Clique em Novo projeto</w:t>
+      </w:r>
+      <w:r>
+        <w:rPr>
+          <w:rFonts w:ascii="Arial" w:hAnsi="Arial"/>
+          <w:sz w:val="22"/>
+        </w:rPr>
+        <w:t>: ou New Project.</w:t>
+      </w:r>
+    </w:p>
+    <w:p>
+      <w:pPr>
+        <w:spacing w:before="80" w:after="100" w:line="276" w:lineRule="auto"/>
+      </w:pPr>
+      <w:r>
+        <w:rPr>
+          <w:rFonts w:ascii="Arial" w:hAnsi="Arial"/>
+          <w:b/>
+          <w:sz w:val="22"/>
+        </w:rPr>
+        <w:t xml:space="preserve">4. </w:t>
+      </w:r>
+      <w:r>
+        <w:rPr>
+          <w:rFonts w:ascii="Arial" w:hAnsi="Arial"/>
+          <w:b/>
+          <w:sz w:val="22"/>
+        </w:rPr>
+        <w:t>Dê um nome ao projeto</w:t>
+      </w:r>
+      <w:r>
+        <w:rPr>
+          <w:rFonts w:ascii="Arial" w:hAnsi="Arial"/>
+          <w:sz w:val="22"/>
+        </w:rPr>
+        <w:t>: por exemplo, CASO 2026-001.</w:t>
+      </w:r>
+    </w:p>
+    <w:p>
+      <w:pPr>
+        <w:spacing w:before="80" w:after="100" w:line="276" w:lineRule="auto"/>
+      </w:pPr>
+      <w:r>
+        <w:rPr>
+          <w:rFonts w:ascii="Arial" w:hAnsi="Arial"/>
+          <w:b/>
+          <w:sz w:val="22"/>
+        </w:rPr>
+        <w:t xml:space="preserve">5. </w:t>
+      </w:r>
+      <w:r>
+        <w:rPr>
+          <w:rFonts w:ascii="Arial" w:hAnsi="Arial"/>
+          <w:b/>
+          <w:sz w:val="22"/>
+        </w:rPr>
+        <w:t>Adicione os dois arquivos</w:t>
+      </w:r>
+      <w:r>
+        <w:rPr>
+          <w:rFonts w:ascii="Arial" w:hAnsi="Arial"/>
+          <w:sz w:val="22"/>
+        </w:rPr>
+        <w:t>: na área Conhecimento do projeto ou Project knowledge.</w:t>
+      </w:r>
+    </w:p>
+    <w:p>
+      <w:pPr>
+        <w:spacing w:before="80" w:after="100" w:line="276" w:lineRule="auto"/>
+      </w:pPr>
+      <w:r>
+        <w:rPr>
+          <w:rFonts w:ascii="Arial" w:hAnsi="Arial"/>
+          <w:b/>
+          <w:sz w:val="22"/>
+        </w:rPr>
+        <w:t xml:space="preserve">6. </w:t>
+      </w:r>
+      <w:r>
+        <w:rPr>
+          <w:rFonts w:ascii="Arial" w:hAnsi="Arial"/>
+          <w:b/>
+          <w:sz w:val="22"/>
+        </w:rPr>
+        <w:t>Defina as instruções do projeto</w:t>
+      </w:r>
+      <w:r>
+        <w:rPr>
+          <w:rFonts w:ascii="Arial" w:hAnsi="Arial"/>
+          <w:sz w:val="22"/>
+        </w:rPr>
+        <w:t>: clique em Set project instructions e cole a instrução abaixo.</w:t>
+      </w:r>
+    </w:p>
+    <w:p>
+      <w:pPr>
+        <w:spacing w:before="40" w:after="140" w:line="264" w:lineRule="auto"/>
+        <w:ind w:left="312" w:right="312"/>
+      </w:pPr>
+      <w:r>
+        <w:rPr>
+          <w:rFonts w:ascii="Courier New" w:hAnsi="Courier New"/>
+          <w:color w:val="000000"/>
+          <w:sz w:val="21"/>
+        </w:rPr>
+        <w:t>Leia e siga integralmente o arquivo PACOTE-UNICO-PARA-CHATGPT-E-CLAUDE.md. Use o papel timbrado oficial nas peças em Word. Nunca invente informações.</w:t>
+      </w:r>
+    </w:p>
+    <w:p>
+      <w:pPr>
+        <w:spacing w:before="80" w:after="100" w:line="276" w:lineRule="auto"/>
+      </w:pPr>
+      <w:r>
+        <w:rPr>
+          <w:rFonts w:ascii="Arial" w:hAnsi="Arial"/>
+          <w:b/>
+          <w:sz w:val="22"/>
+        </w:rPr>
+        <w:t xml:space="preserve">7. </w:t>
+      </w:r>
+      <w:r>
+        <w:rPr>
+          <w:rFonts w:ascii="Arial" w:hAnsi="Arial"/>
+          <w:b/>
+          <w:sz w:val="22"/>
+        </w:rPr>
+        <w:t>Inicie um novo chat dentro do projeto</w:t>
+      </w:r>
+      <w:r>
+        <w:rPr>
+          <w:rFonts w:ascii="Arial" w:hAnsi="Arial"/>
+          <w:sz w:val="22"/>
+        </w:rPr>
+        <w:t>: e use a frase de teste abaixo.</w:t>
+      </w:r>
+    </w:p>
+    <w:p>
+      <w:pPr>
+        <w:spacing w:before="40" w:after="140" w:line="264" w:lineRule="auto"/>
+        <w:ind w:left="312" w:right="312"/>
+      </w:pPr>
+      <w:r>
+        <w:rPr>
+          <w:rFonts w:ascii="Courier New" w:hAnsi="Courier New"/>
+          <w:color w:val="000000"/>
+          <w:sz w:val="21"/>
+        </w:rPr>
+        <w:t>Confirme que leu as instruções da SA Advocacia e diga, em poucas linhas, quais tarefas pode realizar.</w:t>
+      </w:r>
+    </w:p>
+    <w:p>
+      <w:pPr>
+        <w:keepNext/>
+        <w:spacing w:before="280" w:after="120"/>
+      </w:pPr>
+      <w:r>
+        <w:rPr>
+          <w:rFonts w:ascii="Arial" w:hAnsi="Arial"/>
+          <w:b/>
+          <w:color w:val="000000"/>
+          <w:sz w:val="28"/>
+        </w:rPr>
+        <w:t>Atenção ao separar os casos</w:t>
+      </w:r>
+    </w:p>
+    <w:p>
+      <w:pPr>
+        <w:spacing w:before="0" w:after="160" w:line="276" w:lineRule="auto"/>
+      </w:pPr>
+      <w:r>
+        <w:rPr>
+          <w:rFonts w:ascii="Arial" w:hAnsi="Arial"/>
+          <w:b/>
+          <w:i w:val="0"/>
+          <w:color w:val="000000"/>
+          <w:sz w:val="22"/>
+        </w:rPr>
+        <w:t>Crie um projeto diferente para cada cliente ou processo. Repita a instalação dos dois arquivos em cada projeto. Isso evita misturar informações de casos diferentes.</w:t>
+      </w:r>
+    </w:p>
+    <w:p>
+      <w:pPr>
+        <w:keepNext/>
+        <w:spacing w:before="280" w:after="120"/>
+      </w:pPr>
+      <w:r>
+        <w:rPr>
+          <w:rFonts w:ascii="Arial" w:hAnsi="Arial"/>
+          <w:b/>
+          <w:color w:val="000000"/>
+          <w:sz w:val="28"/>
+        </w:rPr>
+        <w:t>Como atualizar</w:t>
+      </w:r>
+    </w:p>
+    <w:p>
+      <w:pPr>
+        <w:spacing w:before="0" w:after="0" w:line="276" w:lineRule="auto"/>
+      </w:pPr>
+      <w:r>
+        <w:rPr>
+          <w:rFonts w:ascii="Arial" w:hAnsi="Arial"/>
+          <w:b w:val="0"/>
+          <w:i w:val="0"/>
+          <w:color w:val="000000"/>
+          <w:sz w:val="21"/>
+        </w:rPr>
+        <w:t>Quando receber uma versão nova do arquivo PACOTE-UNICO-PARA-CHATGPT-E-CLAUDE.md, exclua a versão antiga do projeto e envie a nova. Troque o papel timbrado somente quando o escritório enviar uma versão atualizada.</w:t>
+      </w:r>
+    </w:p>
+    <w:p>
+      <w:pPr>
+        <w:sectPr>
+          <w:pgSz w:w="11906" w:h="16838"/>
+          <w:pgMar w:top="2268" w:right="1134" w:bottom="1701" w:left="1701" w:header="0" w:footer="0" w:gutter="0"/>
+          <w:cols w:space="720"/>
+          <w:docGrid w:linePitch="360"/>
+        </w:sectPr>
+      </w:pPr>
+    </w:p>
+    <w:p>
+      <w:pPr>
+        <w:spacing w:before="0" w:after="920" w:line="276" w:lineRule="auto"/>
+      </w:pPr>
+      <w:r>
+        <w:rPr>
+          <w:rFonts w:ascii="Arial" w:hAnsi="Arial"/>
+          <w:b w:val="0"/>
+          <w:i w:val="0"/>
+          <w:color w:val="FFFFFF"/>
+          <w:sz w:val="2"/>
+        </w:rPr>
+        <w:t xml:space="preserve"> </w:t>
+      </w:r>
+    </w:p>
+    <w:p>
+      <w:pPr>
+        <w:keepNext/>
+        <w:spacing w:before="280" w:after="120"/>
+      </w:pPr>
+      <w:r>
+        <w:rPr>
+          <w:rFonts w:ascii="Arial" w:hAnsi="Arial"/>
+          <w:b/>
+          <w:color w:val="000000"/>
+          <w:sz w:val="28"/>
+        </w:rPr>
+        <w:t>Para que serve</w:t>
       </w:r>
     </w:p>
     <w:p>
@@ -186,7 +760,7 @@
           <w:color w:val="000000"/>
           <w:sz w:val="22"/>
         </w:rPr>
-        <w:t>Produz e revisa peças jurídicas em Word, depois que o caso estiver organizado.</w:t>
+        <w:t>Organizar os arquivos que você enviar, incluindo processos em PDF, conversas exportadas do WhatsApp, documentos, áudios, vídeos e imagens.</w:t>
       </w:r>
     </w:p>
     <w:p>
@@ -208,7 +782,7 @@
           <w:color w:val="000000"/>
           <w:sz w:val="22"/>
         </w:rPr>
-        <w:t>Aplica o papel timbrado oficial, a formatação e as cores definidas pelo escritório.</w:t>
+        <w:t>Criar índice, resumo, linha do tempo, lista do que cada prova demonstra e perguntas sobre o que ainda estiver faltando.</w:t>
       </w:r>
     </w:p>
     <w:p>
@@ -230,22 +804,7 @@
           <w:color w:val="000000"/>
           <w:sz w:val="22"/>
         </w:rPr>
-        <w:t>Ajuda a criar conteúdo jurídico institucional e educativo dentro das regras do escritório.</w:t>
-      </w:r>
-    </w:p>
-    <w:p>
-      <w:pPr>
-        <w:keepNext/>
-        <w:spacing w:before="280" w:after="120"/>
-      </w:pPr>
-      <w:r>
-        <w:rPr>
-          <w:rFonts w:ascii="Arial" w:hAnsi="Arial"/>
-          <w:b/>
-          <w:color w:val="000000"/>
-          <w:sz w:val="28"/>
-        </w:rPr>
-        <w:t>Qual opção escolher</w:t>
+        <w:t>Identificar as provas de forma permanente, como PROVA-0001, sem alterar os arquivos originais.</w:t>
       </w:r>
     </w:p>
     <w:p>
@@ -267,7 +826,7 @@
           <w:color w:val="000000"/>
           <w:sz w:val="22"/>
         </w:rPr>
-        <w:t>ChatGPT: recomendado para a equipe. O administrador importa uma vez.</w:t>
+        <w:t>Preparar e revisar peças jurídicas em Word com a estrutura, a formatação e o papel timbrado oficial do escritório.</w:t>
       </w:r>
     </w:p>
     <w:p>
@@ -289,77 +848,7 @@
           <w:color w:val="000000"/>
           <w:sz w:val="22"/>
         </w:rPr>
-        <w:t>Codex: recomendado para organizar pastas, arquivos e peças em Word.</w:t>
-      </w:r>
-    </w:p>
-    <w:p>
-      <w:pPr>
-        <w:spacing w:after="80" w:line="269" w:lineRule="auto"/>
-        <w:ind w:left="369" w:hanging="198"/>
-      </w:pPr>
-      <w:r>
-        <w:rPr>
-          <w:rFonts w:ascii="Arial" w:hAnsi="Arial"/>
-          <w:color w:val="000000"/>
-          <w:sz w:val="22"/>
-        </w:rPr>
-        <w:t xml:space="preserve">• </w:t>
-      </w:r>
-      <w:r>
-        <w:rPr>
-          <w:rFonts w:ascii="Arial" w:hAnsi="Arial"/>
-          <w:color w:val="000000"/>
-          <w:sz w:val="22"/>
-        </w:rPr>
-        <w:t>Claude: uso simples no navegador por meio de um Projeto conectado ao GitHub.</w:t>
-      </w:r>
-    </w:p>
-    <w:p>
-      <w:pPr>
-        <w:spacing w:after="80" w:line="269" w:lineRule="auto"/>
-        <w:ind w:left="369" w:hanging="198"/>
-      </w:pPr>
-      <w:r>
-        <w:rPr>
-          <w:rFonts w:ascii="Arial" w:hAnsi="Arial"/>
-          <w:color w:val="000000"/>
-          <w:sz w:val="22"/>
-        </w:rPr>
-        <w:t xml:space="preserve">• </w:t>
-      </w:r>
-      <w:r>
-        <w:rPr>
-          <w:rFonts w:ascii="Arial" w:hAnsi="Arial"/>
-          <w:color w:val="000000"/>
-          <w:sz w:val="22"/>
-        </w:rPr>
-        <w:t>Claude Code: trabalho completo com pastas e arquivos, instalado com dois comandos.</w:t>
-      </w:r>
-    </w:p>
-    <w:p>
-      <w:pPr>
-        <w:sectPr>
-          <w:headerReference w:type="default" r:id="rId8"/>
-          <w:pgSz w:w="11906" w:h="16838"/>
-          <w:pgMar w:top="2268" w:right="1134" w:bottom="1701" w:left="1701" w:header="0" w:footer="0" w:gutter="0"/>
-          <w:cols w:space="720"/>
-          <w:docGrid w:linePitch="360"/>
-        </w:sectPr>
-      </w:pPr>
-    </w:p>
-    <w:p>
-      <w:pPr>
-        <w:spacing w:before="0" w:after="920" w:line="276" w:lineRule="auto"/>
-      </w:pPr>
-      <w:r>
-        <w:rPr>
-          <w:rFonts w:ascii="Arial" w:hAnsi="Arial"/>
-          <w:b w:val="0"/>
-          <w:i w:val="0"/>
-          <w:color w:val="FFFFFF"/>
-          <w:sz w:val="2"/>
-        </w:rPr>
-        <w:t xml:space="preserve"> </w:t>
+        <w:t>Separar fatos comprovados de alegações e marcar claramente qualquer informação que ainda precise de confirmação.</w:t>
       </w:r>
     </w:p>
     <w:p>
@@ -374,22 +863,7 @@
           <w:color w:val="000000"/>
           <w:sz w:val="28"/>
         </w:rPr>
-        <w:t>ChatGPT para a equipe</w:t>
-      </w:r>
-    </w:p>
-    <w:p>
-      <w:pPr>
-        <w:spacing w:before="0" w:after="160" w:line="276" w:lineRule="auto"/>
-      </w:pPr>
-      <w:r>
-        <w:rPr>
-          <w:rFonts w:ascii="Arial" w:hAnsi="Arial"/>
-          <w:b w:val="0"/>
-          <w:i w:val="0"/>
-          <w:color w:val="000000"/>
-          <w:sz w:val="22"/>
-        </w:rPr>
-        <w:t>Este é o caminho recomendado para vários advogados. Somente o administrador faz a importação. Depois, cada advogado instala ou recebe o plug-in conforme a política escolhida pelo escritório.</w:t>
+        <w:t>Como usar em um caso novo</w:t>
       </w:r>
     </w:p>
     <w:p>
@@ -410,14 +884,14 @@
           <w:b/>
           <w:sz w:val="22"/>
         </w:rPr>
-        <w:t>Abra a Administração</w:t>
+        <w:t>Abra o projeto daquele caso</w:t>
       </w:r>
       <w:r>
         <w:rPr>
           <w:rFonts w:ascii="Arial" w:hAnsi="Arial"/>
           <w:sz w:val="22"/>
         </w:rPr>
-        <w:t>: entre em Plug-ins e escolha Adicionar e Importar marketplace.</w:t>
+        <w:t>: nunca use o projeto de outro cliente.</w:t>
       </w:r>
     </w:p>
     <w:p>
@@ -438,14 +912,14 @@
           <w:b/>
           <w:sz w:val="22"/>
         </w:rPr>
-        <w:t>Cole o link oficial</w:t>
+        <w:t>Envie tudo o que tiver</w:t>
       </w:r>
       <w:r>
         <w:rPr>
           <w:rFonts w:ascii="Arial" w:hAnsi="Arial"/>
           <w:sz w:val="22"/>
         </w:rPr>
-        <w:t>: no campo Origem.</w:t>
+        <w:t>: inclusive o processo completo, documentos, conversas, ZIP do WhatsApp, áudios, vídeos e imagens.</w:t>
       </w:r>
     </w:p>
     <w:p>
@@ -466,14 +940,28 @@
           <w:b/>
           <w:sz w:val="22"/>
         </w:rPr>
-        <w:t>Deixe Caminho vazio</w:t>
+        <w:t>Peça a organização</w:t>
       </w:r>
       <w:r>
         <w:rPr>
           <w:rFonts w:ascii="Arial" w:hAnsi="Arial"/>
           <w:sz w:val="22"/>
         </w:rPr>
-        <w:t>: porque o arquivo do marketplace já está na raiz do repositório.</w:t>
+        <w:t>: envie a frase abaixo depois de terminar todos os anexos.</w:t>
+      </w:r>
+    </w:p>
+    <w:p>
+      <w:pPr>
+        <w:spacing w:before="40" w:after="140" w:line="264" w:lineRule="auto"/>
+        <w:ind w:left="312" w:right="312"/>
+      </w:pPr>
+      <w:r>
+        <w:rPr>
+          <w:rFonts w:ascii="Courier New" w:hAnsi="Courier New"/>
+          <w:color w:val="000000"/>
+          <w:sz w:val="21"/>
+        </w:rPr>
+        <w:t>Quero abrir e organizar um novo caso jurídico. Primeiro confira o que enviei e me lembre, de forma simples, o que pode estar faltando. Só comece quando eu escrever PODE ORGANIZAR.</w:t>
       </w:r>
     </w:p>
     <w:p>
@@ -494,14 +982,14 @@
           <w:b/>
           <w:sz w:val="22"/>
         </w:rPr>
-        <w:t>Deixe Branch tag ou commit vazio</w:t>
+        <w:t>Responda às perguntas complementares</w:t>
       </w:r>
       <w:r>
         <w:rPr>
           <w:rFonts w:ascii="Arial" w:hAnsi="Arial"/>
           <w:sz w:val="22"/>
         </w:rPr>
-        <w:t>: para acompanhar a versão principal e receber as atualizações futuras.</w:t>
+        <w:t>: elas serão feitas somente depois da leitura do material enviado.</w:t>
       </w:r>
     </w:p>
     <w:p>
@@ -522,75 +1010,48 @@
           <w:b/>
           <w:sz w:val="22"/>
         </w:rPr>
-        <w:t>Clique em Importar marketplace</w:t>
+        <w:t>Peça a peça jurídica</w:t>
       </w:r>
       <w:r>
         <w:rPr>
           <w:rFonts w:ascii="Arial" w:hAnsi="Arial"/>
           <w:sz w:val="22"/>
         </w:rPr>
-        <w:t>: e autorize o acesso ao GitHub quando aparecer.</w:t>
+        <w:t>: quando a organização estiver concluída, use a frase abaixo.</w:t>
       </w:r>
     </w:p>
     <w:p>
       <w:pPr>
-        <w:spacing w:before="80" w:after="100" w:line="276" w:lineRule="auto"/>
+        <w:spacing w:before="40" w:after="140" w:line="264" w:lineRule="auto"/>
+        <w:ind w:left="312" w:right="312"/>
+      </w:pPr>
+      <w:r>
+        <w:rPr>
+          <w:rFonts w:ascii="Courier New" w:hAnsi="Courier New"/>
+          <w:color w:val="000000"/>
+          <w:sz w:val="21"/>
+        </w:rPr>
+        <w:t>Analise o caso organizado e produza a peça jurídica adequada em Word, usando o papel timbrado oficial. Não invente informações e liste tudo que ainda depende de confirmação.</w:t>
+      </w:r>
+    </w:p>
+    <w:p>
+      <w:pPr>
+        <w:keepNext/>
+        <w:spacing w:before="280" w:after="120"/>
       </w:pPr>
       <w:r>
         <w:rPr>
           <w:rFonts w:ascii="Arial" w:hAnsi="Arial"/>
           <w:b/>
-          <w:sz w:val="22"/>
+          <w:color w:val="000000"/>
+          <w:sz w:val="28"/>
         </w:rPr>
-        <w:t xml:space="preserve">6. </w:t>
-      </w:r>
-      <w:r>
-        <w:rPr>
-          <w:rFonts w:ascii="Arial" w:hAnsi="Arial"/>
-          <w:b/>
-          <w:sz w:val="22"/>
-        </w:rPr>
-        <w:t>Abra o plug-in SA Fluxo Jurídico</w:t>
-      </w:r>
-      <w:r>
-        <w:rPr>
-          <w:rFonts w:ascii="Arial" w:hAnsi="Arial"/>
-          <w:sz w:val="22"/>
-        </w:rPr>
-        <w:t>: e escolha a política Instalado para os advogados que devem recebê-lo automaticamente.</w:t>
+        <w:t>Limite importante</w:t>
       </w:r>
     </w:p>
     <w:p>
       <w:pPr>
-        <w:spacing w:before="80" w:after="100" w:line="276" w:lineRule="auto"/>
-      </w:pPr>
-      <w:r>
-        <w:rPr>
-          <w:rFonts w:ascii="Arial" w:hAnsi="Arial"/>
-          <w:b/>
-          <w:sz w:val="22"/>
-        </w:rPr>
-        <w:t xml:space="preserve">7. </w:t>
-      </w:r>
-      <w:r>
-        <w:rPr>
-          <w:rFonts w:ascii="Arial" w:hAnsi="Arial"/>
-          <w:b/>
-          <w:sz w:val="22"/>
-        </w:rPr>
-        <w:t>Abra um novo chat</w:t>
-      </w:r>
-      <w:r>
-        <w:rPr>
-          <w:rFonts w:ascii="Arial" w:hAnsi="Arial"/>
-          <w:sz w:val="22"/>
-        </w:rPr>
-        <w:t>: e peça a tarefa normalmente.</w:t>
-      </w:r>
-    </w:p>
-    <w:p>
-      <w:pPr>
-        <w:spacing w:before="60" w:after="160" w:line="276" w:lineRule="auto"/>
+        <w:spacing w:before="0" w:after="160" w:line="276" w:lineRule="auto"/>
       </w:pPr>
       <w:r>
         <w:rPr>
@@ -600,731 +1061,7 @@
           <w:color w:val="000000"/>
           <w:sz w:val="21"/>
         </w:rPr>
-        <w:t>Se você não encontrar o menu Administração, peça esta instalação ao administrador da conta do escritório.</w:t>
-      </w:r>
-    </w:p>
-    <w:p>
-      <w:pPr>
-        <w:keepNext/>
-        <w:spacing w:before="280" w:after="120"/>
-      </w:pPr>
-      <w:r>
-        <w:rPr>
-          <w:rFonts w:ascii="Arial" w:hAnsi="Arial"/>
-          <w:b/>
-          <w:color w:val="000000"/>
-          <w:sz w:val="28"/>
-        </w:rPr>
-        <w:t>Codex</w:t>
-      </w:r>
-    </w:p>
-    <w:p>
-      <w:pPr>
-        <w:spacing w:before="0" w:after="160" w:line="276" w:lineRule="auto"/>
-      </w:pPr>
-      <w:r>
-        <w:rPr>
-          <w:rFonts w:ascii="Arial" w:hAnsi="Arial"/>
-          <w:b w:val="0"/>
-          <w:i w:val="0"/>
-          <w:color w:val="000000"/>
-          <w:sz w:val="22"/>
-        </w:rPr>
-        <w:t>O Codex é a opção mais prática para organizar uma pasta inteira de caso, converter arquivos, transcrever materiais e produzir documentos. Se o plug-in já foi liberado no workspace do ChatGPT, abra Plug-ins, instale SA Fluxo Jurídico e inicie uma nova tarefa. No Codex CLI, digite o comando abaixo para abrir o catálogo de plug-ins.</w:t>
-      </w:r>
-    </w:p>
-    <w:p>
-      <w:pPr>
-        <w:spacing w:before="40" w:after="140" w:line="264" w:lineRule="auto"/>
-        <w:ind w:left="312" w:right="312"/>
-      </w:pPr>
-      <w:r>
-        <w:rPr>
-          <w:rFonts w:ascii="Courier New" w:hAnsi="Courier New"/>
-          <w:color w:val="000000"/>
-          <w:sz w:val="21"/>
-        </w:rPr>
-        <w:t>/plugins</w:t>
-      </w:r>
-    </w:p>
-    <w:p>
-      <w:pPr>
-        <w:sectPr>
-          <w:pgSz w:w="11906" w:h="16838"/>
-          <w:pgMar w:top="2268" w:right="1134" w:bottom="1701" w:left="1701" w:header="0" w:footer="0" w:gutter="0"/>
-          <w:cols w:space="720"/>
-          <w:docGrid w:linePitch="360"/>
-        </w:sectPr>
-      </w:pPr>
-    </w:p>
-    <w:p>
-      <w:pPr>
-        <w:spacing w:before="0" w:after="920" w:line="276" w:lineRule="auto"/>
-      </w:pPr>
-      <w:r>
-        <w:rPr>
-          <w:rFonts w:ascii="Arial" w:hAnsi="Arial"/>
-          <w:b w:val="0"/>
-          <w:i w:val="0"/>
-          <w:color w:val="FFFFFF"/>
-          <w:sz w:val="2"/>
-        </w:rPr>
-        <w:t xml:space="preserve"> </w:t>
-      </w:r>
-    </w:p>
-    <w:p>
-      <w:pPr>
-        <w:keepNext/>
-        <w:spacing w:before="280" w:after="120"/>
-      </w:pPr>
-      <w:r>
-        <w:rPr>
-          <w:rFonts w:ascii="Arial" w:hAnsi="Arial"/>
-          <w:b/>
-          <w:color w:val="000000"/>
-          <w:sz w:val="28"/>
-        </w:rPr>
-        <w:t>Claude no navegador</w:t>
-      </w:r>
-    </w:p>
-    <w:p>
-      <w:pPr>
-        <w:spacing w:before="0" w:after="160" w:line="276" w:lineRule="auto"/>
-      </w:pPr>
-      <w:r>
-        <w:rPr>
-          <w:rFonts w:ascii="Arial" w:hAnsi="Arial"/>
-          <w:b w:val="0"/>
-          <w:i w:val="0"/>
-          <w:color w:val="000000"/>
-          <w:sz w:val="22"/>
-        </w:rPr>
-        <w:t>No Claude comum, use um Projeto conectado ao GitHub. Ele recebe as instruções do escritório, mas não substitui o Codex ou o Claude Code para trabalhar diretamente com uma pasta inteira do computador.</w:t>
-      </w:r>
-    </w:p>
-    <w:p>
-      <w:pPr>
-        <w:spacing w:before="80" w:after="100" w:line="276" w:lineRule="auto"/>
-      </w:pPr>
-      <w:r>
-        <w:rPr>
-          <w:rFonts w:ascii="Arial" w:hAnsi="Arial"/>
-          <w:b/>
-          <w:sz w:val="22"/>
-        </w:rPr>
-        <w:t xml:space="preserve">1. </w:t>
-      </w:r>
-      <w:r>
-        <w:rPr>
-          <w:rFonts w:ascii="Arial" w:hAnsi="Arial"/>
-          <w:b/>
-          <w:sz w:val="22"/>
-        </w:rPr>
-        <w:t>Crie um Projeto</w:t>
-      </w:r>
-      <w:r>
-        <w:rPr>
-          <w:rFonts w:ascii="Arial" w:hAnsi="Arial"/>
-          <w:sz w:val="22"/>
-        </w:rPr>
-        <w:t>: com o nome Fluxo Jurídico SA Advocacia.</w:t>
-      </w:r>
-    </w:p>
-    <w:p>
-      <w:pPr>
-        <w:spacing w:before="80" w:after="100" w:line="276" w:lineRule="auto"/>
-      </w:pPr>
-      <w:r>
-        <w:rPr>
-          <w:rFonts w:ascii="Arial" w:hAnsi="Arial"/>
-          <w:b/>
-          <w:sz w:val="22"/>
-        </w:rPr>
-        <w:t xml:space="preserve">2. </w:t>
-      </w:r>
-      <w:r>
-        <w:rPr>
-          <w:rFonts w:ascii="Arial" w:hAnsi="Arial"/>
-          <w:b/>
-          <w:sz w:val="22"/>
-        </w:rPr>
-        <w:t>Na área de conhecimento do Projeto</w:t>
-      </w:r>
-      <w:r>
-        <w:rPr>
-          <w:rFonts w:ascii="Arial" w:hAnsi="Arial"/>
-          <w:sz w:val="22"/>
-        </w:rPr>
-        <w:t>: clique no sinal de mais e escolha GitHub.</w:t>
-      </w:r>
-    </w:p>
-    <w:p>
-      <w:pPr>
-        <w:spacing w:before="80" w:after="100" w:line="276" w:lineRule="auto"/>
-      </w:pPr>
-      <w:r>
-        <w:rPr>
-          <w:rFonts w:ascii="Arial" w:hAnsi="Arial"/>
-          <w:b/>
-          <w:sz w:val="22"/>
-        </w:rPr>
-        <w:t xml:space="preserve">3. </w:t>
-      </w:r>
-      <w:r>
-        <w:rPr>
-          <w:rFonts w:ascii="Arial" w:hAnsi="Arial"/>
-          <w:b/>
-          <w:sz w:val="22"/>
-        </w:rPr>
-        <w:t>Cole o link oficial</w:t>
-      </w:r>
-      <w:r>
-        <w:rPr>
-          <w:rFonts w:ascii="Arial" w:hAnsi="Arial"/>
-          <w:sz w:val="22"/>
-        </w:rPr>
-        <w:t>: autorize o GitHub e selecione os arquivos do repositório.</w:t>
-      </w:r>
-    </w:p>
-    <w:p>
-      <w:pPr>
-        <w:spacing w:before="80" w:after="100" w:line="276" w:lineRule="auto"/>
-      </w:pPr>
-      <w:r>
-        <w:rPr>
-          <w:rFonts w:ascii="Arial" w:hAnsi="Arial"/>
-          <w:b/>
-          <w:sz w:val="22"/>
-        </w:rPr>
-        <w:t xml:space="preserve">4. </w:t>
-      </w:r>
-      <w:r>
-        <w:rPr>
-          <w:rFonts w:ascii="Arial" w:hAnsi="Arial"/>
-          <w:b/>
-          <w:sz w:val="22"/>
-        </w:rPr>
-        <w:t>Quando o repositório for atualizado</w:t>
-      </w:r>
-      <w:r>
-        <w:rPr>
-          <w:rFonts w:ascii="Arial" w:hAnsi="Arial"/>
-          <w:sz w:val="22"/>
-        </w:rPr>
-        <w:t>: use Sincronizar antes de começar um trabalho novo.</w:t>
-      </w:r>
-    </w:p>
-    <w:p>
-      <w:pPr>
-        <w:keepNext/>
-        <w:spacing w:before="280" w:after="120"/>
-      </w:pPr>
-      <w:r>
-        <w:rPr>
-          <w:rFonts w:ascii="Arial" w:hAnsi="Arial"/>
-          <w:b/>
-          <w:color w:val="000000"/>
-          <w:sz w:val="28"/>
-        </w:rPr>
-        <w:t>Claude Code</w:t>
-      </w:r>
-    </w:p>
-    <w:p>
-      <w:pPr>
-        <w:spacing w:before="0" w:after="160" w:line="276" w:lineRule="auto"/>
-      </w:pPr>
-      <w:r>
-        <w:rPr>
-          <w:rFonts w:ascii="Arial" w:hAnsi="Arial"/>
-          <w:b w:val="0"/>
-          <w:i w:val="0"/>
-          <w:color w:val="000000"/>
-          <w:sz w:val="22"/>
-        </w:rPr>
-        <w:t>Abra o Claude Code e envie os dois comandos abaixo, um de cada vez.</w:t>
-      </w:r>
-    </w:p>
-    <w:p>
-      <w:pPr>
-        <w:spacing w:before="40" w:after="140" w:line="264" w:lineRule="auto"/>
-        <w:ind w:left="312" w:right="312"/>
-      </w:pPr>
-      <w:r>
-        <w:rPr>
-          <w:rFonts w:ascii="Courier New" w:hAnsi="Courier New"/>
-          <w:color w:val="000000"/>
-          <w:sz w:val="21"/>
-        </w:rPr>
-        <w:t>/plugin marketplace add mix7producao/fluxo-juridico</w:t>
-      </w:r>
-    </w:p>
-    <w:p>
-      <w:pPr>
-        <w:spacing w:before="40" w:after="140" w:line="264" w:lineRule="auto"/>
-        <w:ind w:left="312" w:right="312"/>
-      </w:pPr>
-      <w:r>
-        <w:rPr>
-          <w:rFonts w:ascii="Courier New" w:hAnsi="Courier New"/>
-          <w:color w:val="000000"/>
-          <w:sz w:val="21"/>
-        </w:rPr>
-        <w:t>/plugin install sa-fluxo-juridico@sa-advocacia</w:t>
-      </w:r>
-    </w:p>
-    <w:p>
-      <w:pPr>
-        <w:spacing w:before="0" w:after="160" w:line="276" w:lineRule="auto"/>
-      </w:pPr>
-      <w:r>
-        <w:rPr>
-          <w:rFonts w:ascii="Arial" w:hAnsi="Arial"/>
-          <w:b w:val="0"/>
-          <w:i w:val="0"/>
-          <w:color w:val="000000"/>
-          <w:sz w:val="22"/>
-        </w:rPr>
-        <w:t>Para receber atualizações automáticas, abra /plugin, entre em Marketplaces, escolha sa-advocacia e ative Enable auto-update. Se aparecer a mensagem para recarregar, use /reload-plugins.</w:t>
-      </w:r>
-    </w:p>
-    <w:p>
-      <w:pPr>
-        <w:sectPr>
-          <w:pgSz w:w="11906" w:h="16838"/>
-          <w:pgMar w:top="2268" w:right="1134" w:bottom="1701" w:left="1701" w:header="0" w:footer="0" w:gutter="0"/>
-          <w:cols w:space="720"/>
-          <w:docGrid w:linePitch="360"/>
-        </w:sectPr>
-      </w:pPr>
-    </w:p>
-    <w:p>
-      <w:pPr>
-        <w:spacing w:before="0" w:after="920" w:line="276" w:lineRule="auto"/>
-      </w:pPr>
-      <w:r>
-        <w:rPr>
-          <w:rFonts w:ascii="Arial" w:hAnsi="Arial"/>
-          <w:b w:val="0"/>
-          <w:i w:val="0"/>
-          <w:color w:val="FFFFFF"/>
-          <w:sz w:val="2"/>
-        </w:rPr>
-        <w:t xml:space="preserve"> </w:t>
-      </w:r>
-    </w:p>
-    <w:p>
-      <w:pPr>
-        <w:keepNext/>
-        <w:spacing w:before="280" w:after="120"/>
-      </w:pPr>
-      <w:r>
-        <w:rPr>
-          <w:rFonts w:ascii="Arial" w:hAnsi="Arial"/>
-          <w:b/>
-          <w:color w:val="000000"/>
-          <w:sz w:val="28"/>
-        </w:rPr>
-        <w:t>Como começar depois da instalação</w:t>
-      </w:r>
-    </w:p>
-    <w:p>
-      <w:pPr>
-        <w:spacing w:before="0" w:after="40" w:line="276" w:lineRule="auto"/>
-      </w:pPr>
-      <w:r>
-        <w:rPr>
-          <w:rFonts w:ascii="Arial" w:hAnsi="Arial"/>
-          <w:b w:val="0"/>
-          <w:i w:val="0"/>
-          <w:color w:val="000000"/>
-          <w:sz w:val="22"/>
-        </w:rPr>
-        <w:t>Para organizar um caso, coloque todos os arquivos na pasta do caso e use a frase abaixo.</w:t>
-      </w:r>
-    </w:p>
-    <w:p>
-      <w:pPr>
-        <w:spacing w:before="40" w:after="140" w:line="264" w:lineRule="auto"/>
-        <w:ind w:left="312" w:right="312"/>
-      </w:pPr>
-      <w:r>
-        <w:rPr>
-          <w:rFonts w:ascii="Courier New" w:hAnsi="Courier New"/>
-          <w:color w:val="000000"/>
-          <w:sz w:val="21"/>
-        </w:rPr>
-        <w:t>Quero abrir e organizar um novo caso jurídico.</w:t>
-      </w:r>
-    </w:p>
-    <w:p>
-      <w:pPr>
-        <w:spacing w:before="0" w:after="160" w:line="276" w:lineRule="auto"/>
-      </w:pPr>
-      <w:r>
-        <w:rPr>
-          <w:rFonts w:ascii="Arial" w:hAnsi="Arial"/>
-          <w:b w:val="0"/>
-          <w:i w:val="0"/>
-          <w:color w:val="000000"/>
-          <w:sz w:val="22"/>
-        </w:rPr>
-        <w:t>A ferramenta primeiro lembrará o que pode estar faltando. Quando você confirmar que terminou de enviar, ela preservará os originais e começará a organização.</w:t>
-      </w:r>
-    </w:p>
-    <w:p>
-      <w:pPr>
-        <w:spacing w:before="0" w:after="40" w:line="276" w:lineRule="auto"/>
-      </w:pPr>
-      <w:r>
-        <w:rPr>
-          <w:rFonts w:ascii="Arial" w:hAnsi="Arial"/>
-          <w:b w:val="0"/>
-          <w:i w:val="0"/>
-          <w:color w:val="000000"/>
-          <w:sz w:val="22"/>
-        </w:rPr>
-        <w:t>Depois que o caso estiver organizado, use a frase abaixo para produzir a peça.</w:t>
-      </w:r>
-    </w:p>
-    <w:p>
-      <w:pPr>
-        <w:spacing w:before="40" w:after="140" w:line="264" w:lineRule="auto"/>
-        <w:ind w:left="312" w:right="312"/>
-      </w:pPr>
-      <w:r>
-        <w:rPr>
-          <w:rFonts w:ascii="Courier New" w:hAnsi="Courier New"/>
-          <w:color w:val="000000"/>
-          <w:sz w:val="21"/>
-        </w:rPr>
-        <w:t>Analise o caso organizado e produza a peça jurídica adequada em Word. Não invente informações e liste tudo que ainda depende de confirmação.</w:t>
-      </w:r>
-    </w:p>
-    <w:p>
-      <w:pPr>
-        <w:keepNext/>
-        <w:spacing w:before="280" w:after="120"/>
-      </w:pPr>
-      <w:r>
-        <w:rPr>
-          <w:rFonts w:ascii="Arial" w:hAnsi="Arial"/>
-          <w:b/>
-          <w:color w:val="000000"/>
-          <w:sz w:val="28"/>
-        </w:rPr>
-        <w:t>Como a peça em Word será entregue</w:t>
-      </w:r>
-    </w:p>
-    <w:tbl>
-      <w:tblPr>
-        <w:tblW w:type="auto" w:w="0"/>
-        <w:tblLayout w:type="fixed"/>
-        <w:tblLook w:firstColumn="1" w:firstRow="1" w:lastColumn="0" w:lastRow="0" w:noHBand="0" w:noVBand="1" w:val="04A0"/>
-      </w:tblPr>
-      <w:tblGrid>
-        <w:gridCol w:w="4535"/>
-        <w:gridCol w:w="4535"/>
-      </w:tblGrid>
-      <w:tr>
-        <w:trPr>
-          <w:tblHeader w:val="true"/>
-        </w:trPr>
-        <w:tc>
-          <w:tcPr>
-            <w:tcW w:type="dxa" w:w="4337"/>
-            <w:vAlign w:val="center"/>
-            <w:tcMar>
-              <w:top w:w="120" w:type="dxa"/>
-              <w:start w:w="140" w:type="dxa"/>
-              <w:bottom w:w="120" w:type="dxa"/>
-              <w:end w:w="140" w:type="dxa"/>
-            </w:tcMar>
-            <w:tcBorders>
-              <w:top w:val="single" w:sz="6" w:color="D9D9D9"/>
-              <w:left w:val="single" w:sz="6" w:color="D9D9D9"/>
-              <w:bottom w:val="single" w:sz="6" w:color="D9D9D9"/>
-              <w:right w:val="single" w:sz="6" w:color="D9D9D9"/>
-            </w:tcBorders>
-            <w:shd w:fill="D9C9BA"/>
-          </w:tcPr>
-          <w:p>
-            <w:pPr>
-              <w:spacing w:after="0" w:before="0"/>
-            </w:pPr>
-            <w:r>
-              <w:rPr>
-                <w:rFonts w:ascii="Arial" w:hAnsi="Arial"/>
-                <w:b/>
-                <w:color w:val="000000"/>
-                <w:sz w:val="21"/>
-              </w:rPr>
-              <w:t>O pacote prepara</w:t>
-            </w:r>
-          </w:p>
-        </w:tc>
-        <w:tc>
-          <w:tcPr>
-            <w:tcW w:type="dxa" w:w="4337"/>
-            <w:vAlign w:val="center"/>
-            <w:tcMar>
-              <w:top w:w="120" w:type="dxa"/>
-              <w:start w:w="140" w:type="dxa"/>
-              <w:bottom w:w="120" w:type="dxa"/>
-              <w:end w:w="140" w:type="dxa"/>
-            </w:tcMar>
-            <w:tcBorders>
-              <w:top w:val="single" w:sz="6" w:color="D9D9D9"/>
-              <w:left w:val="single" w:sz="6" w:color="D9D9D9"/>
-              <w:bottom w:val="single" w:sz="6" w:color="D9D9D9"/>
-              <w:right w:val="single" w:sz="6" w:color="D9D9D9"/>
-            </w:tcBorders>
-            <w:shd w:fill="D9C9BA"/>
-          </w:tcPr>
-          <w:p>
-            <w:pPr>
-              <w:spacing w:after="0" w:before="0"/>
-            </w:pPr>
-            <w:r>
-              <w:rPr>
-                <w:rFonts w:ascii="Arial" w:hAnsi="Arial"/>
-                <w:b/>
-                <w:color w:val="000000"/>
-                <w:sz w:val="21"/>
-              </w:rPr>
-              <w:t>A advogada revisa</w:t>
-            </w:r>
-          </w:p>
-        </w:tc>
-      </w:tr>
-      <w:tr>
-        <w:tc>
-          <w:tcPr>
-            <w:tcW w:type="dxa" w:w="4337"/>
-            <w:vAlign w:val="center"/>
-            <w:tcMar>
-              <w:top w:w="120" w:type="dxa"/>
-              <w:start w:w="140" w:type="dxa"/>
-              <w:bottom w:w="120" w:type="dxa"/>
-              <w:end w:w="140" w:type="dxa"/>
-            </w:tcMar>
-            <w:tcBorders>
-              <w:top w:val="single" w:sz="6" w:color="D9D9D9"/>
-              <w:left w:val="single" w:sz="6" w:color="D9D9D9"/>
-              <w:bottom w:val="single" w:sz="6" w:color="D9D9D9"/>
-              <w:right w:val="single" w:sz="6" w:color="D9D9D9"/>
-            </w:tcBorders>
-          </w:tcPr>
-          <w:p>
-            <w:pPr>
-              <w:spacing w:after="0" w:before="0"/>
-            </w:pPr>
-            <w:r>
-              <w:rPr>
-                <w:rFonts w:ascii="Arial" w:hAnsi="Arial"/>
-                <w:b w:val="0"/>
-                <w:color w:val="000000"/>
-                <w:sz w:val="21"/>
-              </w:rPr>
-              <w:t>Arquivo editável em Word no papel timbrado oficial.</w:t>
-            </w:r>
-          </w:p>
-        </w:tc>
-        <w:tc>
-          <w:tcPr>
-            <w:tcW w:type="dxa" w:w="4337"/>
-            <w:vAlign w:val="center"/>
-            <w:tcMar>
-              <w:top w:w="120" w:type="dxa"/>
-              <w:start w:w="140" w:type="dxa"/>
-              <w:bottom w:w="120" w:type="dxa"/>
-              <w:end w:w="140" w:type="dxa"/>
-            </w:tcMar>
-            <w:tcBorders>
-              <w:top w:val="single" w:sz="6" w:color="D9D9D9"/>
-              <w:left w:val="single" w:sz="6" w:color="D9D9D9"/>
-              <w:bottom w:val="single" w:sz="6" w:color="D9D9D9"/>
-              <w:right w:val="single" w:sz="6" w:color="D9D9D9"/>
-            </w:tcBorders>
-          </w:tcPr>
-          <w:p>
-            <w:pPr>
-              <w:spacing w:after="0" w:before="0"/>
-            </w:pPr>
-            <w:r>
-              <w:rPr>
-                <w:rFonts w:ascii="Arial" w:hAnsi="Arial"/>
-                <w:b w:val="0"/>
-                <w:color w:val="000000"/>
-                <w:sz w:val="21"/>
-              </w:rPr>
-              <w:t>Se o timbrado correto foi usado para aquele escritório.</w:t>
-            </w:r>
-          </w:p>
-        </w:tc>
-      </w:tr>
-      <w:tr>
-        <w:tc>
-          <w:tcPr>
-            <w:tcW w:type="dxa" w:w="4337"/>
-            <w:vAlign w:val="center"/>
-            <w:tcMar>
-              <w:top w:w="120" w:type="dxa"/>
-              <w:start w:w="140" w:type="dxa"/>
-              <w:bottom w:w="120" w:type="dxa"/>
-              <w:end w:w="140" w:type="dxa"/>
-            </w:tcMar>
-            <w:tcBorders>
-              <w:top w:val="single" w:sz="6" w:color="D9D9D9"/>
-              <w:left w:val="single" w:sz="6" w:color="D9D9D9"/>
-              <w:bottom w:val="single" w:sz="6" w:color="D9D9D9"/>
-              <w:right w:val="single" w:sz="6" w:color="D9D9D9"/>
-            </w:tcBorders>
-            <w:shd w:fill="F7F3F0"/>
-          </w:tcPr>
-          <w:p>
-            <w:pPr>
-              <w:spacing w:after="0" w:before="0"/>
-            </w:pPr>
-            <w:r>
-              <w:rPr>
-                <w:rFonts w:ascii="Arial" w:hAnsi="Arial"/>
-                <w:b w:val="0"/>
-                <w:color w:val="000000"/>
-                <w:sz w:val="21"/>
-              </w:rPr>
-              <w:t>Formatação, cores e estrutura definidas nas instruções do escritório.</w:t>
-            </w:r>
-          </w:p>
-        </w:tc>
-        <w:tc>
-          <w:tcPr>
-            <w:tcW w:type="dxa" w:w="4337"/>
-            <w:vAlign w:val="center"/>
-            <w:tcMar>
-              <w:top w:w="120" w:type="dxa"/>
-              <w:start w:w="140" w:type="dxa"/>
-              <w:bottom w:w="120" w:type="dxa"/>
-              <w:end w:w="140" w:type="dxa"/>
-            </w:tcMar>
-            <w:tcBorders>
-              <w:top w:val="single" w:sz="6" w:color="D9D9D9"/>
-              <w:left w:val="single" w:sz="6" w:color="D9D9D9"/>
-              <w:bottom w:val="single" w:sz="6" w:color="D9D9D9"/>
-              <w:right w:val="single" w:sz="6" w:color="D9D9D9"/>
-            </w:tcBorders>
-            <w:shd w:fill="F7F3F0"/>
-          </w:tcPr>
-          <w:p>
-            <w:pPr>
-              <w:spacing w:after="0" w:before="0"/>
-            </w:pPr>
-            <w:r>
-              <w:rPr>
-                <w:rFonts w:ascii="Arial" w:hAnsi="Arial"/>
-                <w:b w:val="0"/>
-                <w:color w:val="000000"/>
-                <w:sz w:val="21"/>
-              </w:rPr>
-              <w:t>Estratégia, fatos, pedidos, valores, prazos e anexos.</w:t>
-            </w:r>
-          </w:p>
-        </w:tc>
-      </w:tr>
-      <w:tr>
-        <w:tc>
-          <w:tcPr>
-            <w:tcW w:type="dxa" w:w="4337"/>
-            <w:vAlign w:val="center"/>
-            <w:tcMar>
-              <w:top w:w="120" w:type="dxa"/>
-              <w:start w:w="140" w:type="dxa"/>
-              <w:bottom w:w="120" w:type="dxa"/>
-              <w:end w:w="140" w:type="dxa"/>
-            </w:tcMar>
-            <w:tcBorders>
-              <w:top w:val="single" w:sz="6" w:color="D9D9D9"/>
-              <w:left w:val="single" w:sz="6" w:color="D9D9D9"/>
-              <w:bottom w:val="single" w:sz="6" w:color="D9D9D9"/>
-              <w:right w:val="single" w:sz="6" w:color="D9D9D9"/>
-            </w:tcBorders>
-          </w:tcPr>
-          <w:p>
-            <w:pPr>
-              <w:spacing w:after="0" w:before="0"/>
-            </w:pPr>
-            <w:r>
-              <w:rPr>
-                <w:rFonts w:ascii="Arial" w:hAnsi="Arial"/>
-                <w:b w:val="0"/>
-                <w:color w:val="000000"/>
-                <w:sz w:val="21"/>
-              </w:rPr>
-              <w:t>Indicação clara do que está comprovado e do que precisa ser confirmado.</w:t>
-            </w:r>
-          </w:p>
-        </w:tc>
-        <w:tc>
-          <w:tcPr>
-            <w:tcW w:type="dxa" w:w="4337"/>
-            <w:vAlign w:val="center"/>
-            <w:tcMar>
-              <w:top w:w="120" w:type="dxa"/>
-              <w:start w:w="140" w:type="dxa"/>
-              <w:bottom w:w="120" w:type="dxa"/>
-              <w:end w:w="140" w:type="dxa"/>
-            </w:tcMar>
-            <w:tcBorders>
-              <w:top w:val="single" w:sz="6" w:color="D9D9D9"/>
-              <w:left w:val="single" w:sz="6" w:color="D9D9D9"/>
-              <w:bottom w:val="single" w:sz="6" w:color="D9D9D9"/>
-              <w:right w:val="single" w:sz="6" w:color="D9D9D9"/>
-            </w:tcBorders>
-          </w:tcPr>
-          <w:p>
-            <w:pPr>
-              <w:spacing w:after="0" w:before="0"/>
-            </w:pPr>
-            <w:r>
-              <w:rPr>
-                <w:rFonts w:ascii="Arial" w:hAnsi="Arial"/>
-                <w:b w:val="0"/>
-                <w:color w:val="000000"/>
-                <w:sz w:val="21"/>
-              </w:rPr>
-              <w:t>Versão final antes de assinar ou protocolar.</w:t>
-            </w:r>
-          </w:p>
-        </w:tc>
-      </w:tr>
-    </w:tbl>
-    <w:p>
-      <w:pPr>
-        <w:keepNext/>
-        <w:spacing w:before="280" w:after="120"/>
-      </w:pPr>
-      <w:r>
-        <w:rPr>
-          <w:rFonts w:ascii="Arial" w:hAnsi="Arial"/>
-          <w:b/>
-          <w:color w:val="000000"/>
-          <w:sz w:val="28"/>
-        </w:rPr>
-        <w:t>Regra de sigilo</w:t>
-      </w:r>
-    </w:p>
-    <w:p>
-      <w:pPr>
-        <w:spacing w:before="0" w:after="0" w:line="276" w:lineRule="auto"/>
-      </w:pPr>
-      <w:r>
-        <w:rPr>
-          <w:rFonts w:ascii="Arial" w:hAnsi="Arial"/>
-          <w:b/>
-          <w:i w:val="0"/>
-          <w:color w:val="000000"/>
-          <w:sz w:val="22"/>
-        </w:rPr>
-        <w:t>O GitHub guarda somente o manual, as instruções e os modelos vazios. Processos, conversas, provas, documentos pessoais e dados de clientes ficam exclusivamente na pasta de cada caso.</w:t>
+        <w:t>O ChatGPT e o Claude pessoais somente conseguem analisar os arquivos que você enviar ao projeto ou ao chat. Eles não abrem sozinhos uma pasta do seu computador. A advogada responsável deve revisar a peça antes de assinar ou protocolar.</w:t>
       </w:r>
     </w:p>
     <w:sectPr>

</xml_diff>

<commit_message>
Inclui instalação pelo GitHub no manual
</commit_message>
<xml_diff>
--- a/guias/MANUAL-DO-ADVOGADO-FLUXO-JURIDICO-SA-ADVOCACIA.docx
+++ b/guias/MANUAL-DO-ADVOGADO-FLUXO-JURIDICO-SA-ADVOCACIA.docx
@@ -75,7 +75,207 @@
           <w:color w:val="000000"/>
           <w:sz w:val="28"/>
         </w:rPr>
-        <w:t>Tenha estes dois arquivos em mãos</w:t>
+        <w:t>Comece pelo GitHub</w:t>
+      </w:r>
+    </w:p>
+    <w:p>
+      <w:pPr>
+        <w:spacing w:before="0" w:after="40" w:line="276" w:lineRule="auto"/>
+      </w:pPr>
+      <w:r>
+        <w:rPr>
+          <w:rFonts w:ascii="Arial" w:hAnsi="Arial"/>
+          <w:b w:val="0"/>
+          <w:i w:val="0"/>
+          <w:color w:val="000000"/>
+          <w:sz w:val="22"/>
+        </w:rPr>
+        <w:t>Clique no link abaixo. Ele abre o pacote oficial que contém as instruções e os modelos do escritório.</w:t>
+      </w:r>
+    </w:p>
+    <w:p>
+      <w:pPr>
+        <w:keepNext/>
+        <w:spacing w:before="60" w:after="200"/>
+      </w:pPr>
+      <w:hyperlink r:id="rId11">
+        <w:r>
+          <w:rPr>
+            <w:color w:val="0563C1"/>
+            <w:u w:val="single"/>
+          </w:rPr>
+          <w:t>ABRIR O PACOTE NO GITHUB</w:t>
+        </w:r>
+      </w:hyperlink>
+    </w:p>
+    <w:p>
+      <w:pPr>
+        <w:spacing w:before="0" w:after="160" w:line="276" w:lineRule="auto"/>
+      </w:pPr>
+      <w:r>
+        <w:rPr>
+          <w:rFonts w:ascii="Arial" w:hAnsi="Arial"/>
+          <w:b w:val="0"/>
+          <w:i w:val="0"/>
+          <w:color w:val="595959"/>
+          <w:sz w:val="19"/>
+        </w:rPr>
+        <w:t>Endereço completo: https://github.com/mix7producao/fluxo-juridico</w:t>
+      </w:r>
+    </w:p>
+    <w:p>
+      <w:pPr>
+        <w:keepNext/>
+        <w:spacing w:before="280" w:after="120"/>
+      </w:pPr>
+      <w:r>
+        <w:rPr>
+          <w:rFonts w:ascii="Arial" w:hAnsi="Arial"/>
+          <w:b/>
+          <w:color w:val="000000"/>
+          <w:sz w:val="28"/>
+        </w:rPr>
+        <w:t>Como baixar os arquivos</w:t>
+      </w:r>
+    </w:p>
+    <w:p>
+      <w:pPr>
+        <w:spacing w:before="80" w:after="100" w:line="276" w:lineRule="auto"/>
+      </w:pPr>
+      <w:r>
+        <w:rPr>
+          <w:rFonts w:ascii="Arial" w:hAnsi="Arial"/>
+          <w:b/>
+          <w:sz w:val="22"/>
+        </w:rPr>
+        <w:t xml:space="preserve">1. </w:t>
+      </w:r>
+      <w:r>
+        <w:rPr>
+          <w:rFonts w:ascii="Arial" w:hAnsi="Arial"/>
+          <w:b/>
+          <w:sz w:val="22"/>
+        </w:rPr>
+        <w:t>Entre na sua conta do GitHub</w:t>
+      </w:r>
+      <w:r>
+        <w:rPr>
+          <w:rFonts w:ascii="Arial" w:hAnsi="Arial"/>
+          <w:sz w:val="22"/>
+        </w:rPr>
+        <w:t>: se a página pedir acesso.</w:t>
+      </w:r>
+    </w:p>
+    <w:p>
+      <w:pPr>
+        <w:spacing w:before="80" w:after="100" w:line="276" w:lineRule="auto"/>
+      </w:pPr>
+      <w:r>
+        <w:rPr>
+          <w:rFonts w:ascii="Arial" w:hAnsi="Arial"/>
+          <w:b/>
+          <w:sz w:val="22"/>
+        </w:rPr>
+        <w:t xml:space="preserve">2. </w:t>
+      </w:r>
+      <w:r>
+        <w:rPr>
+          <w:rFonts w:ascii="Arial" w:hAnsi="Arial"/>
+          <w:b/>
+          <w:sz w:val="22"/>
+        </w:rPr>
+        <w:t>Na página do pacote</w:t>
+      </w:r>
+      <w:r>
+        <w:rPr>
+          <w:rFonts w:ascii="Arial" w:hAnsi="Arial"/>
+          <w:sz w:val="22"/>
+        </w:rPr>
+        <w:t>: clique no botão verde Code.</w:t>
+      </w:r>
+    </w:p>
+    <w:p>
+      <w:pPr>
+        <w:spacing w:before="80" w:after="100" w:line="276" w:lineRule="auto"/>
+      </w:pPr>
+      <w:r>
+        <w:rPr>
+          <w:rFonts w:ascii="Arial" w:hAnsi="Arial"/>
+          <w:b/>
+          <w:sz w:val="22"/>
+        </w:rPr>
+        <w:t xml:space="preserve">3. </w:t>
+      </w:r>
+      <w:r>
+        <w:rPr>
+          <w:rFonts w:ascii="Arial" w:hAnsi="Arial"/>
+          <w:b/>
+          <w:sz w:val="22"/>
+        </w:rPr>
+        <w:t>Clique em Download ZIP</w:t>
+      </w:r>
+      <w:r>
+        <w:rPr>
+          <w:rFonts w:ascii="Arial" w:hAnsi="Arial"/>
+          <w:sz w:val="22"/>
+        </w:rPr>
+        <w:t>: e aguarde o download terminar.</w:t>
+      </w:r>
+    </w:p>
+    <w:p>
+      <w:pPr>
+        <w:spacing w:before="80" w:after="100" w:line="276" w:lineRule="auto"/>
+      </w:pPr>
+      <w:r>
+        <w:rPr>
+          <w:rFonts w:ascii="Arial" w:hAnsi="Arial"/>
+          <w:b/>
+          <w:sz w:val="22"/>
+        </w:rPr>
+        <w:t xml:space="preserve">4. </w:t>
+      </w:r>
+      <w:r>
+        <w:rPr>
+          <w:rFonts w:ascii="Arial" w:hAnsi="Arial"/>
+          <w:b/>
+          <w:sz w:val="22"/>
+        </w:rPr>
+        <w:t>Abra a pasta Downloads</w:t>
+      </w:r>
+      <w:r>
+        <w:rPr>
+          <w:rFonts w:ascii="Arial" w:hAnsi="Arial"/>
+          <w:sz w:val="22"/>
+        </w:rPr>
+        <w:t>: clique com o botão direito no ZIP e escolha Extrair tudo.</w:t>
+      </w:r>
+    </w:p>
+    <w:p>
+      <w:pPr>
+        <w:spacing w:before="80" w:after="100" w:line="276" w:lineRule="auto"/>
+      </w:pPr>
+      <w:r>
+        <w:rPr>
+          <w:rFonts w:ascii="Arial" w:hAnsi="Arial"/>
+          <w:b/>
+          <w:sz w:val="22"/>
+        </w:rPr>
+        <w:t xml:space="preserve">5. </w:t>
+      </w:r>
+      <w:r>
+        <w:rPr>
+          <w:rFonts w:ascii="Arial" w:hAnsi="Arial"/>
+          <w:b/>
+          <w:sz w:val="22"/>
+        </w:rPr>
+        <w:t>Abra a pasta extraída</w:t>
+      </w:r>
+      <w:r>
+        <w:rPr>
+          <w:rFonts w:ascii="Arial" w:hAnsi="Arial"/>
+          <w:sz w:val="22"/>
+        </w:rPr>
+        <w:t>: e localize os dois arquivos indicados abaixo.</w:t>
       </w:r>
     </w:p>
     <w:p>
@@ -97,7 +297,7 @@
           <w:color w:val="000000"/>
           <w:sz w:val="22"/>
         </w:rPr>
-        <w:t>PACOTE-UNICO-PARA-CHATGPT-E-CLAUDE.md</w:t>
+        <w:t>PACOTE-UNICO-PARA-CHATGPT-E-CLAUDE.md, na primeira pasta.</w:t>
       </w:r>
     </w:p>
     <w:p>
@@ -119,12 +319,12 @@
           <w:color w:val="000000"/>
           <w:sz w:val="22"/>
         </w:rPr>
-        <w:t>PAPEL-TIMBRADO-OFICIAL-SA-ADVOCACIA.docx</w:t>
+        <w:t>PAPEL-TIMBRADO-OFICIAL-SA-ADVOCACIA.docx, dentro de plugins, sa-fluxo-juridico, assets e papeis-timbrados.</w:t>
       </w:r>
     </w:p>
     <w:p>
       <w:pPr>
-        <w:spacing w:before="0" w:after="200" w:line="276" w:lineRule="auto"/>
+        <w:spacing w:before="0" w:after="0" w:line="276" w:lineRule="auto"/>
       </w:pPr>
       <w:r>
         <w:rPr>
@@ -134,7 +334,33 @@
           <w:color w:val="000000"/>
           <w:sz w:val="21"/>
         </w:rPr>
-        <w:t>Os dois arquivos são enviados junto com este manual. Não altere o conteúdo deles.</w:t>
+        <w:t>Se aparecer Página não encontrada, o repositório ainda não foi liberado para a sua conta do GitHub. Peça acesso ao responsável pelo escritório.</w:t>
+      </w:r>
+    </w:p>
+    <w:p>
+      <w:pPr>
+        <w:sectPr>
+          <w:headerReference w:type="default" r:id="rId8"/>
+          <w:pgSz w:w="11906" w:h="16838"/>
+          <w:pgMar w:top="2268" w:right="1134" w:bottom="1701" w:left="1701" w:header="0" w:footer="0" w:gutter="0"/>
+          <w:cols w:space="720"/>
+          <w:docGrid w:linePitch="360"/>
+        </w:sectPr>
+      </w:pPr>
+    </w:p>
+    <w:p>
+      <w:pPr>
+        <w:spacing w:before="0" w:after="920" w:line="276" w:lineRule="auto"/>
+      </w:pPr>
+      <w:r>
+        <w:rPr>
+          <w:rFonts w:ascii="Arial" w:hAnsi="Arial"/>
+          <w:b w:val="0"/>
+          <w:i w:val="0"/>
+          <w:color w:val="FFFFFF"/>
+          <w:sz w:val="2"/>
+        </w:rPr>
+        <w:t xml:space="preserve"> </w:t>
       </w:r>
     </w:p>
     <w:p>
@@ -282,7 +508,7 @@
           <w:b/>
           <w:sz w:val="22"/>
         </w:rPr>
-        <w:t>Adicione os dois arquivos</w:t>
+        <w:t>Adicione os dois arquivos baixados do GitHub</w:t>
       </w:r>
       <w:r>
         <w:rPr>
@@ -378,8 +604,67 @@
     </w:p>
     <w:p>
       <w:pPr>
+        <w:keepNext/>
+        <w:spacing w:before="280" w:after="120"/>
+      </w:pPr>
+      <w:r>
+        <w:rPr>
+          <w:rFonts w:ascii="Arial" w:hAnsi="Arial"/>
+          <w:b/>
+          <w:color w:val="000000"/>
+          <w:sz w:val="28"/>
+        </w:rPr>
+        <w:t>Conexão direta com o GitHub no ChatGPT</w:t>
+      </w:r>
+    </w:p>
+    <w:p>
+      <w:pPr>
+        <w:spacing w:before="0" w:after="160" w:line="276" w:lineRule="auto"/>
+      </w:pPr>
+      <w:r>
+        <w:rPr>
+          <w:rFonts w:ascii="Arial" w:hAnsi="Arial"/>
+          <w:b w:val="0"/>
+          <w:i w:val="0"/>
+          <w:color w:val="000000"/>
+          <w:sz w:val="21"/>
+        </w:rPr>
+        <w:t>Se GitHub aparecer em Configurações e Apps, clique em Conectar, autorize sua conta e permita o acesso ao repositório fluxo-juridico. Essa opção varia conforme o plano e pode não aparecer no chat comum. O envio dos dois arquivos acima continua sendo o caminho mais simples e confiável.</w:t>
+      </w:r>
+    </w:p>
+    <w:p>
+      <w:pPr>
+        <w:keepNext/>
+        <w:spacing w:before="280" w:after="120"/>
+      </w:pPr>
+      <w:r>
+        <w:rPr>
+          <w:rFonts w:ascii="Arial" w:hAnsi="Arial"/>
+          <w:b/>
+          <w:color w:val="000000"/>
+          <w:sz w:val="28"/>
+        </w:rPr>
+        <w:t>Como atualizar no ChatGPT</w:t>
+      </w:r>
+    </w:p>
+    <w:p>
+      <w:pPr>
+        <w:spacing w:before="0" w:after="0" w:line="276" w:lineRule="auto"/>
+      </w:pPr>
+      <w:r>
+        <w:rPr>
+          <w:rFonts w:ascii="Arial" w:hAnsi="Arial"/>
+          <w:b w:val="0"/>
+          <w:i w:val="0"/>
+          <w:color w:val="000000"/>
+          <w:sz w:val="21"/>
+        </w:rPr>
+        <w:t>Quando o escritório avisar que o pacote mudou, volte ao GitHub, baixe o ZIP atualizado, exclua do projeto o arquivo PACOTE-UNICO-PARA-CHATGPT-E-CLAUDE.md antigo e envie o novo.</w:t>
+      </w:r>
+    </w:p>
+    <w:p>
+      <w:pPr>
         <w:sectPr>
-          <w:headerReference w:type="default" r:id="rId8"/>
           <w:pgSz w:w="11906" w:h="16838"/>
           <w:pgMar w:top="2268" w:right="1134" w:bottom="1701" w:left="1701" w:header="0" w:footer="0" w:gutter="0"/>
           <w:cols w:space="720"/>
@@ -547,14 +832,14 @@
           <w:b/>
           <w:sz w:val="22"/>
         </w:rPr>
-        <w:t>Adicione os dois arquivos</w:t>
+        <w:t>Conecte o GitHub</w:t>
       </w:r>
       <w:r>
         <w:rPr>
           <w:rFonts w:ascii="Arial" w:hAnsi="Arial"/>
           <w:sz w:val="22"/>
         </w:rPr>
-        <w:t>: na área Conhecimento do projeto ou Project knowledge.</w:t>
+        <w:t>: na área Conhecimento do projeto, clique no sinal de mais e escolha GitHub.</w:t>
       </w:r>
     </w:p>
     <w:p>
@@ -568,6 +853,90 @@
           <w:sz w:val="22"/>
         </w:rPr>
         <w:t xml:space="preserve">6. </w:t>
+      </w:r>
+      <w:r>
+        <w:rPr>
+          <w:rFonts w:ascii="Arial" w:hAnsi="Arial"/>
+          <w:b/>
+          <w:sz w:val="22"/>
+        </w:rPr>
+        <w:t>Cole o link do pacote</w:t>
+      </w:r>
+      <w:r>
+        <w:rPr>
+          <w:rFonts w:ascii="Arial" w:hAnsi="Arial"/>
+          <w:sz w:val="22"/>
+        </w:rPr>
+        <w:t>: use https://github.com/mix7producao/fluxo-juridico e autorize o acesso quando solicitado.</w:t>
+      </w:r>
+    </w:p>
+    <w:p>
+      <w:pPr>
+        <w:spacing w:before="80" w:after="100" w:line="276" w:lineRule="auto"/>
+      </w:pPr>
+      <w:r>
+        <w:rPr>
+          <w:rFonts w:ascii="Arial" w:hAnsi="Arial"/>
+          <w:b/>
+          <w:sz w:val="22"/>
+        </w:rPr>
+        <w:t xml:space="preserve">7. </w:t>
+      </w:r>
+      <w:r>
+        <w:rPr>
+          <w:rFonts w:ascii="Arial" w:hAnsi="Arial"/>
+          <w:b/>
+          <w:sz w:val="22"/>
+        </w:rPr>
+        <w:t>Selecione as instruções</w:t>
+      </w:r>
+      <w:r>
+        <w:rPr>
+          <w:rFonts w:ascii="Arial" w:hAnsi="Arial"/>
+          <w:sz w:val="22"/>
+        </w:rPr>
+        <w:t>: escolha o arquivo PACOTE-UNICO-PARA-CHATGPT-E-CLAUDE.md e confirme.</w:t>
+      </w:r>
+    </w:p>
+    <w:p>
+      <w:pPr>
+        <w:spacing w:before="80" w:after="100" w:line="276" w:lineRule="auto"/>
+      </w:pPr>
+      <w:r>
+        <w:rPr>
+          <w:rFonts w:ascii="Arial" w:hAnsi="Arial"/>
+          <w:b/>
+          <w:sz w:val="22"/>
+        </w:rPr>
+        <w:t xml:space="preserve">8. </w:t>
+      </w:r>
+      <w:r>
+        <w:rPr>
+          <w:rFonts w:ascii="Arial" w:hAnsi="Arial"/>
+          <w:b/>
+          <w:sz w:val="22"/>
+        </w:rPr>
+        <w:t>Envie o papel timbrado</w:t>
+      </w:r>
+      <w:r>
+        <w:rPr>
+          <w:rFonts w:ascii="Arial" w:hAnsi="Arial"/>
+          <w:sz w:val="22"/>
+        </w:rPr>
+        <w:t>: adicione o arquivo DOCX que foi baixado do GitHub.</w:t>
+      </w:r>
+    </w:p>
+    <w:p>
+      <w:pPr>
+        <w:spacing w:before="80" w:after="100" w:line="276" w:lineRule="auto"/>
+      </w:pPr>
+      <w:r>
+        <w:rPr>
+          <w:rFonts w:ascii="Arial" w:hAnsi="Arial"/>
+          <w:b/>
+          <w:sz w:val="22"/>
+        </w:rPr>
+        <w:t xml:space="preserve">9. </w:t>
       </w:r>
       <w:r>
         <w:rPr>
@@ -609,7 +978,7 @@
           <w:b/>
           <w:sz w:val="22"/>
         </w:rPr>
-        <w:t xml:space="preserve">7. </w:t>
+        <w:t xml:space="preserve">10. </w:t>
       </w:r>
       <w:r>
         <w:rPr>
@@ -653,12 +1022,42 @@
           <w:color w:val="000000"/>
           <w:sz w:val="28"/>
         </w:rPr>
+        <w:t>Como atualizar no Claude</w:t>
+      </w:r>
+    </w:p>
+    <w:p>
+      <w:pPr>
+        <w:spacing w:before="0" w:after="160" w:line="276" w:lineRule="auto"/>
+      </w:pPr>
+      <w:r>
+        <w:rPr>
+          <w:rFonts w:ascii="Arial" w:hAnsi="Arial"/>
+          <w:b w:val="0"/>
+          <w:i w:val="0"/>
+          <w:color w:val="000000"/>
+          <w:sz w:val="21"/>
+        </w:rPr>
+        <w:t>Clique em Sync ou Sincronizar na conexão do GitHub antes de começar um trabalho novo. O Claude buscará a versão atual das instruções selecionadas. Troque o papel timbrado manualmente somente quando houver uma versão nova.</w:t>
+      </w:r>
+    </w:p>
+    <w:p>
+      <w:pPr>
+        <w:keepNext/>
+        <w:spacing w:before="280" w:after="120"/>
+      </w:pPr>
+      <w:r>
+        <w:rPr>
+          <w:rFonts w:ascii="Arial" w:hAnsi="Arial"/>
+          <w:b/>
+          <w:color w:val="000000"/>
+          <w:sz w:val="28"/>
+        </w:rPr>
         <w:t>Atenção ao separar os casos</w:t>
       </w:r>
     </w:p>
     <w:p>
       <w:pPr>
-        <w:spacing w:before="0" w:after="160" w:line="276" w:lineRule="auto"/>
+        <w:spacing w:before="0" w:after="0" w:line="276" w:lineRule="auto"/>
       </w:pPr>
       <w:r>
         <w:rPr>
@@ -668,37 +1067,7 @@
           <w:color w:val="000000"/>
           <w:sz w:val="22"/>
         </w:rPr>
-        <w:t>Crie um projeto diferente para cada cliente ou processo. Repita a instalação dos dois arquivos em cada projeto. Isso evita misturar informações de casos diferentes.</w:t>
-      </w:r>
-    </w:p>
-    <w:p>
-      <w:pPr>
-        <w:keepNext/>
-        <w:spacing w:before="280" w:after="120"/>
-      </w:pPr>
-      <w:r>
-        <w:rPr>
-          <w:rFonts w:ascii="Arial" w:hAnsi="Arial"/>
-          <w:b/>
-          <w:color w:val="000000"/>
-          <w:sz w:val="28"/>
-        </w:rPr>
-        <w:t>Como atualizar</w:t>
-      </w:r>
-    </w:p>
-    <w:p>
-      <w:pPr>
-        <w:spacing w:before="0" w:after="0" w:line="276" w:lineRule="auto"/>
-      </w:pPr>
-      <w:r>
-        <w:rPr>
-          <w:rFonts w:ascii="Arial" w:hAnsi="Arial"/>
-          <w:b w:val="0"/>
-          <w:i w:val="0"/>
-          <w:color w:val="000000"/>
-          <w:sz w:val="21"/>
-        </w:rPr>
-        <w:t>Quando receber uma versão nova do arquivo PACOTE-UNICO-PARA-CHATGPT-E-CLAUDE.md, exclua a versão antiga do projeto e envie a nova. Troque o papel timbrado somente quando o escritório enviar uma versão atualizada.</w:t>
+        <w:t>Crie um projeto diferente para cada cliente ou processo. Repita a configuração em cada projeto. Isso evita misturar informações de casos diferentes.</w:t>
       </w:r>
     </w:p>
     <w:p>

</xml_diff>